<commit_message>
Ergänzung Grober Unterrichtsplan, Blocksatz
</commit_message>
<xml_diff>
--- a/8_KI-Aufbaumodule/KI-A2/KI-A2.0_Modulbeschreibung.docx
+++ b/8_KI-Aufbaumodule/KI-A2/KI-A2.0_Modulbeschreibung.docx
@@ -28,7 +28,7 @@
                 <wp:extent cx="4381500" cy="1120140"/>
                 <wp:effectExtent l="0" t="0" r="0" b="0"/>
                 <wp:wrapSquare wrapText="bothSides" distT="0" distB="0" distL="114300" distR="114300"/>
-                <wp:docPr id="338" name=""/>
+                <wp:docPr id="338" name="Gruppieren 338"/>
                 <wp:cNvGraphicFramePr/>
                 <a:graphic xmlns:a="http://schemas.openxmlformats.org/drawingml/2006/main">
                   <a:graphicData uri="http://schemas.microsoft.com/office/word/2010/wordprocessingGroup">
@@ -178,7 +178,7 @@
           </mc:Choice>
           <mc:Fallback>
             <w:pict>
-              <v:group w14:anchorId="568BE594" id="_x0000_s1026" style="position:absolute;margin-left:0;margin-top:32pt;width:345pt;height:88.2pt;z-index:251658240" coordorigin="31552,32199" coordsize="43815,11201" o:gfxdata="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">
+              <v:group w14:anchorId="568BE594" id="Gruppieren 338" o:spid="_x0000_s1026" style="position:absolute;margin-left:0;margin-top:32pt;width:345pt;height:88.2pt;z-index:251658240" coordorigin="31552,32199" coordsize="43815,11201" o:gfxdata="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">
                 <v:group id="Gruppieren 1" o:spid="_x0000_s1027" style="position:absolute;left:31552;top:32199;width:43815;height:11201" coordsize="43815,11203" o:gfxdata="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">
                   <v:rect id="Rechteck 2" o:spid="_x0000_s1028" style="position:absolute;width:43815;height:11203;visibility:visible;mso-wrap-style:square;v-text-anchor:middle" o:gfxdata="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" filled="f" stroked="f">
                     <v:textbox inset="2.53958mm,2.53958mm,2.53958mm,2.53958mm">
@@ -417,7 +417,6 @@
           <w:docPartUnique/>
         </w:docPartObj>
       </w:sdtPr>
-      <w:sdtEndPr/>
       <w:sdtContent>
         <w:p>
           <w:pPr>
@@ -1437,11 +1436,26 @@
       </w:r>
     </w:p>
     <w:p>
+      <w:pPr>
+        <w:jc w:val="both"/>
+        <w:rPr>
+          <w:color w:val="000000" w:themeColor="text1"/>
+          <w:rPrChange w:id="4" w:author="Imke Endjer" w:date="2023-02-23T09:56:00Z">
+            <w:rPr/>
+          </w:rPrChange>
+        </w:rPr>
+        <w:pPrChange w:id="5" w:author="Imke Endjer" w:date="2023-02-23T09:56:00Z">
+          <w:pPr/>
+        </w:pPrChange>
+      </w:pPr>
       <w:r>
-        <w:t xml:space="preserve">In diesem Modul können die Schülerinnen und Schüler selbst einen (einfachen) digitalen Sprachassistenten entwickeln und gestalten. Dazu benötigen sie nur Bastelmaterialien, einen Computer mit Internetzugang und das eigene Smartphone. Das Modul zeigt, dass </w:t>
-      </w:r>
-      <w:r>
-        <w:t xml:space="preserve">KI auch als kreatives Werkzeug für persönliche Projekte verwendet werden kann. </w:t>
+        <w:rPr>
+          <w:color w:val="000000" w:themeColor="text1"/>
+          <w:rPrChange w:id="6" w:author="Imke Endjer" w:date="2023-02-23T09:56:00Z">
+            <w:rPr/>
+          </w:rPrChange>
+        </w:rPr>
+        <w:t xml:space="preserve">In diesem Modul können die Schülerinnen und Schüler selbst einen (einfachen) digitalen Sprachassistenten entwickeln und gestalten. Dazu benötigen sie nur Bastelmaterialien, einen Computer mit Internetzugang und das eigene Smartphone. Das Modul zeigt, dass KI auch als kreatives Werkzeug für persönliche Projekte verwendet werden kann. </w:t>
       </w:r>
     </w:p>
     <w:tbl>
@@ -1464,6 +1478,13 @@
         <w:gridCol w:w="3044"/>
         <w:gridCol w:w="522"/>
         <w:gridCol w:w="5392"/>
+        <w:tblGridChange w:id="7">
+          <w:tblGrid>
+            <w:gridCol w:w="3044"/>
+            <w:gridCol w:w="522"/>
+            <w:gridCol w:w="5392"/>
+          </w:tblGrid>
+        </w:tblGridChange>
       </w:tblGrid>
       <w:tr>
         <w:tc>
@@ -1487,11 +1508,20 @@
               <w:cnfStyle w:val="000000000000" w:firstRow="0" w:lastRow="0" w:firstColumn="0" w:lastColumn="0" w:oddVBand="0" w:evenVBand="0" w:oddHBand="0" w:evenHBand="0" w:firstRowFirstColumn="0" w:firstRowLastColumn="0" w:lastRowFirstColumn="0" w:lastRowLastColumn="0"/>
               <w:rPr>
                 <w:rFonts w:ascii="Arial" w:eastAsia="Arial" w:hAnsi="Arial" w:cs="Arial"/>
+                <w:color w:val="000000" w:themeColor="text1"/>
+                <w:rPrChange w:id="8" w:author="Imke Endjer" w:date="2023-02-23T09:56:00Z">
+                  <w:rPr>
+                    <w:rFonts w:ascii="Arial" w:eastAsia="Arial" w:hAnsi="Arial" w:cs="Arial"/>
+                  </w:rPr>
+                </w:rPrChange>
               </w:rPr>
             </w:pPr>
             <w:r>
               <w:rPr>
-                <w:rFonts w:ascii="Arial" w:eastAsia="Arial" w:hAnsi="Arial" w:cs="Arial"/>
+                <w:color w:val="000000" w:themeColor="text1"/>
+                <w:rPrChange w:id="9" w:author="Imke Endjer" w:date="2023-02-23T09:56:00Z">
+                  <w:rPr/>
+                </w:rPrChange>
               </w:rPr>
               <w:t>Mit KI gestalten</w:t>
             </w:r>
@@ -1523,6 +1553,13 @@
               <w:rPr>
                 <w:rFonts w:ascii="Arial" w:eastAsia="Arial" w:hAnsi="Arial" w:cs="Arial"/>
                 <w:b/>
+                <w:color w:val="000000" w:themeColor="text1"/>
+                <w:rPrChange w:id="10" w:author="Imke Endjer" w:date="2023-02-23T09:56:00Z">
+                  <w:rPr>
+                    <w:rFonts w:ascii="Arial" w:eastAsia="Arial" w:hAnsi="Arial" w:cs="Arial"/>
+                    <w:b/>
+                  </w:rPr>
+                </w:rPrChange>
               </w:rPr>
             </w:pPr>
           </w:p>
@@ -1536,11 +1573,20 @@
               <w:cnfStyle w:val="000000000000" w:firstRow="0" w:lastRow="0" w:firstColumn="0" w:lastColumn="0" w:oddVBand="0" w:evenVBand="0" w:oddHBand="0" w:evenHBand="0" w:firstRowFirstColumn="0" w:firstRowLastColumn="0" w:lastRowFirstColumn="0" w:lastRowLastColumn="0"/>
               <w:rPr>
                 <w:rFonts w:ascii="Arial" w:eastAsia="Arial" w:hAnsi="Arial" w:cs="Arial"/>
+                <w:color w:val="000000" w:themeColor="text1"/>
+                <w:rPrChange w:id="11" w:author="Imke Endjer" w:date="2023-02-23T09:56:00Z">
+                  <w:rPr>
+                    <w:rFonts w:ascii="Arial" w:eastAsia="Arial" w:hAnsi="Arial" w:cs="Arial"/>
+                  </w:rPr>
+                </w:rPrChange>
               </w:rPr>
             </w:pPr>
             <w:r>
               <w:rPr>
-                <w:rFonts w:ascii="Arial" w:eastAsia="Arial" w:hAnsi="Arial" w:cs="Arial"/>
+                <w:color w:val="000000" w:themeColor="text1"/>
+                <w:rPrChange w:id="12" w:author="Imke Endjer" w:date="2023-02-23T09:56:00Z">
+                  <w:rPr/>
+                </w:rPrChange>
               </w:rPr>
               <w:t xml:space="preserve"> 4. bis 5. Klasse</w:t>
             </w:r>
@@ -1580,12 +1626,24 @@
               <w:rPr>
                 <w:rFonts w:ascii="Arial" w:eastAsia="Arial" w:hAnsi="Arial" w:cs="Arial"/>
                 <w:b/>
+                <w:color w:val="000000" w:themeColor="text1"/>
+                <w:rPrChange w:id="13" w:author="Imke Endjer" w:date="2023-02-23T09:56:00Z">
+                  <w:rPr>
+                    <w:rFonts w:ascii="Arial" w:eastAsia="Arial" w:hAnsi="Arial" w:cs="Arial"/>
+                    <w:b/>
+                  </w:rPr>
+                </w:rPrChange>
               </w:rPr>
             </w:pPr>
             <w:r>
               <w:rPr>
-                <w:rFonts w:ascii="Arial" w:eastAsia="Arial" w:hAnsi="Arial" w:cs="Arial"/>
                 <w:b/>
+                <w:color w:val="000000" w:themeColor="text1"/>
+                <w:rPrChange w:id="14" w:author="Imke Endjer" w:date="2023-02-23T09:56:00Z">
+                  <w:rPr>
+                    <w:b/>
+                  </w:rPr>
+                </w:rPrChange>
               </w:rPr>
               <w:t>X</w:t>
             </w:r>
@@ -1600,11 +1658,20 @@
               <w:cnfStyle w:val="000000000000" w:firstRow="0" w:lastRow="0" w:firstColumn="0" w:lastColumn="0" w:oddVBand="0" w:evenVBand="0" w:oddHBand="0" w:evenHBand="0" w:firstRowFirstColumn="0" w:firstRowLastColumn="0" w:lastRowFirstColumn="0" w:lastRowLastColumn="0"/>
               <w:rPr>
                 <w:rFonts w:ascii="Arial" w:eastAsia="Arial" w:hAnsi="Arial" w:cs="Arial"/>
+                <w:color w:val="000000" w:themeColor="text1"/>
+                <w:rPrChange w:id="15" w:author="Imke Endjer" w:date="2023-02-23T09:56:00Z">
+                  <w:rPr>
+                    <w:rFonts w:ascii="Arial" w:eastAsia="Arial" w:hAnsi="Arial" w:cs="Arial"/>
+                  </w:rPr>
+                </w:rPrChange>
               </w:rPr>
             </w:pPr>
             <w:r>
               <w:rPr>
-                <w:rFonts w:ascii="Arial" w:eastAsia="Arial" w:hAnsi="Arial" w:cs="Arial"/>
+                <w:color w:val="000000" w:themeColor="text1"/>
+                <w:rPrChange w:id="16" w:author="Imke Endjer" w:date="2023-02-23T09:56:00Z">
+                  <w:rPr/>
+                </w:rPrChange>
               </w:rPr>
               <w:t xml:space="preserve"> 6. bis 7. Klasse</w:t>
             </w:r>
@@ -1644,12 +1711,24 @@
               <w:rPr>
                 <w:rFonts w:ascii="Arial" w:eastAsia="Arial" w:hAnsi="Arial" w:cs="Arial"/>
                 <w:b/>
+                <w:color w:val="000000" w:themeColor="text1"/>
+                <w:rPrChange w:id="17" w:author="Imke Endjer" w:date="2023-02-23T09:56:00Z">
+                  <w:rPr>
+                    <w:rFonts w:ascii="Arial" w:eastAsia="Arial" w:hAnsi="Arial" w:cs="Arial"/>
+                    <w:b/>
+                  </w:rPr>
+                </w:rPrChange>
               </w:rPr>
             </w:pPr>
             <w:r>
               <w:rPr>
-                <w:rFonts w:ascii="Arial" w:eastAsia="Arial" w:hAnsi="Arial" w:cs="Arial"/>
                 <w:b/>
+                <w:color w:val="000000" w:themeColor="text1"/>
+                <w:rPrChange w:id="18" w:author="Imke Endjer" w:date="2023-02-23T09:56:00Z">
+                  <w:rPr>
+                    <w:b/>
+                  </w:rPr>
+                </w:rPrChange>
               </w:rPr>
               <w:t>X</w:t>
             </w:r>
@@ -1664,11 +1743,20 @@
               <w:cnfStyle w:val="000000000000" w:firstRow="0" w:lastRow="0" w:firstColumn="0" w:lastColumn="0" w:oddVBand="0" w:evenVBand="0" w:oddHBand="0" w:evenHBand="0" w:firstRowFirstColumn="0" w:firstRowLastColumn="0" w:lastRowFirstColumn="0" w:lastRowLastColumn="0"/>
               <w:rPr>
                 <w:rFonts w:ascii="Arial" w:eastAsia="Arial" w:hAnsi="Arial" w:cs="Arial"/>
+                <w:color w:val="000000" w:themeColor="text1"/>
+                <w:rPrChange w:id="19" w:author="Imke Endjer" w:date="2023-02-23T09:56:00Z">
+                  <w:rPr>
+                    <w:rFonts w:ascii="Arial" w:eastAsia="Arial" w:hAnsi="Arial" w:cs="Arial"/>
+                  </w:rPr>
+                </w:rPrChange>
               </w:rPr>
             </w:pPr>
             <w:r>
               <w:rPr>
-                <w:rFonts w:ascii="Arial" w:eastAsia="Arial" w:hAnsi="Arial" w:cs="Arial"/>
+                <w:color w:val="000000" w:themeColor="text1"/>
+                <w:rPrChange w:id="20" w:author="Imke Endjer" w:date="2023-02-23T09:56:00Z">
+                  <w:rPr/>
+                </w:rPrChange>
               </w:rPr>
               <w:t xml:space="preserve"> 8. bis 10. Klasse</w:t>
             </w:r>
@@ -1708,6 +1796,13 @@
               <w:rPr>
                 <w:rFonts w:ascii="Arial" w:eastAsia="Arial" w:hAnsi="Arial" w:cs="Arial"/>
                 <w:b/>
+                <w:color w:val="000000" w:themeColor="text1"/>
+                <w:rPrChange w:id="21" w:author="Imke Endjer" w:date="2023-02-23T09:56:00Z">
+                  <w:rPr>
+                    <w:rFonts w:ascii="Arial" w:eastAsia="Arial" w:hAnsi="Arial" w:cs="Arial"/>
+                    <w:b/>
+                  </w:rPr>
+                </w:rPrChange>
               </w:rPr>
             </w:pPr>
           </w:p>
@@ -1721,11 +1816,20 @@
               <w:cnfStyle w:val="000000000000" w:firstRow="0" w:lastRow="0" w:firstColumn="0" w:lastColumn="0" w:oddVBand="0" w:evenVBand="0" w:oddHBand="0" w:evenHBand="0" w:firstRowFirstColumn="0" w:firstRowLastColumn="0" w:lastRowFirstColumn="0" w:lastRowLastColumn="0"/>
               <w:rPr>
                 <w:rFonts w:ascii="Arial" w:eastAsia="Arial" w:hAnsi="Arial" w:cs="Arial"/>
+                <w:color w:val="000000" w:themeColor="text1"/>
+                <w:rPrChange w:id="22" w:author="Imke Endjer" w:date="2023-02-23T09:56:00Z">
+                  <w:rPr>
+                    <w:rFonts w:ascii="Arial" w:eastAsia="Arial" w:hAnsi="Arial" w:cs="Arial"/>
+                  </w:rPr>
+                </w:rPrChange>
               </w:rPr>
             </w:pPr>
             <w:r>
               <w:rPr>
-                <w:rFonts w:ascii="Arial" w:eastAsia="Arial" w:hAnsi="Arial" w:cs="Arial"/>
+                <w:color w:val="000000" w:themeColor="text1"/>
+                <w:rPrChange w:id="23" w:author="Imke Endjer" w:date="2023-02-23T09:56:00Z">
+                  <w:rPr/>
+                </w:rPrChange>
               </w:rPr>
               <w:t>11. bis 12. Klasse</w:t>
             </w:r>
@@ -1754,11 +1858,20 @@
               <w:cnfStyle w:val="000000000000" w:firstRow="0" w:lastRow="0" w:firstColumn="0" w:lastColumn="0" w:oddVBand="0" w:evenVBand="0" w:oddHBand="0" w:evenHBand="0" w:firstRowFirstColumn="0" w:firstRowLastColumn="0" w:lastRowFirstColumn="0" w:lastRowLastColumn="0"/>
               <w:rPr>
                 <w:rFonts w:ascii="Arial" w:eastAsia="Arial" w:hAnsi="Arial" w:cs="Arial"/>
+                <w:color w:val="000000" w:themeColor="text1"/>
+                <w:rPrChange w:id="24" w:author="Imke Endjer" w:date="2023-02-23T09:56:00Z">
+                  <w:rPr>
+                    <w:rFonts w:ascii="Arial" w:eastAsia="Arial" w:hAnsi="Arial" w:cs="Arial"/>
+                  </w:rPr>
+                </w:rPrChange>
               </w:rPr>
             </w:pPr>
             <w:r>
               <w:rPr>
-                <w:rFonts w:ascii="Arial" w:eastAsia="Arial" w:hAnsi="Arial" w:cs="Arial"/>
+                <w:color w:val="000000" w:themeColor="text1"/>
+                <w:rPrChange w:id="25" w:author="Imke Endjer" w:date="2023-02-23T09:56:00Z">
+                  <w:rPr/>
+                </w:rPrChange>
               </w:rPr>
               <w:t>4 bis 8 Unterrichtsstunden, auch als Projekttag umsetzbar</w:t>
             </w:r>
@@ -1819,7 +1932,7 @@
                 <w:right w:val="none" w:sz="0" w:space="0" w:color="000000"/>
                 <w:between w:val="none" w:sz="0" w:space="0" w:color="000000"/>
               </w:pBdr>
-              <w:spacing w:before="120" w:line="240" w:lineRule="auto"/>
+              <w:spacing w:before="120"/>
               <w:cnfStyle w:val="000000000000" w:firstRow="0" w:lastRow="0" w:firstColumn="0" w:lastColumn="0" w:oddVBand="0" w:evenVBand="0" w:oddHBand="0" w:evenHBand="0" w:firstRowFirstColumn="0" w:firstRowLastColumn="0" w:lastRowFirstColumn="0" w:lastRowLastColumn="0"/>
               <w:rPr>
                 <w:rFonts w:ascii="Arial" w:eastAsia="Arial" w:hAnsi="Arial" w:cs="Arial"/>
@@ -1847,7 +1960,7 @@
                 <w:right w:val="none" w:sz="0" w:space="0" w:color="000000"/>
                 <w:between w:val="none" w:sz="0" w:space="0" w:color="000000"/>
               </w:pBdr>
-              <w:spacing w:before="120" w:line="240" w:lineRule="auto"/>
+              <w:spacing w:before="120"/>
               <w:cnfStyle w:val="000000000000" w:firstRow="0" w:lastRow="0" w:firstColumn="0" w:lastColumn="0" w:oddVBand="0" w:evenVBand="0" w:oddHBand="0" w:evenHBand="0" w:firstRowFirstColumn="0" w:firstRowLastColumn="0" w:lastRowFirstColumn="0" w:lastRowLastColumn="0"/>
               <w:rPr>
                 <w:rFonts w:ascii="Arial" w:eastAsia="Arial" w:hAnsi="Arial" w:cs="Arial"/>
@@ -1859,14 +1972,7 @@
                 <w:rFonts w:ascii="Arial" w:eastAsia="Arial" w:hAnsi="Arial" w:cs="Arial"/>
                 <w:color w:val="000000"/>
               </w:rPr>
-              <w:t>die Interaktion zwischen KI-System und menschlichen Nutzern untersuchen und personale sowie gesellschaftliche Implika</w:t>
-            </w:r>
-            <w:r>
-              <w:rPr>
-                <w:rFonts w:ascii="Arial" w:eastAsia="Arial" w:hAnsi="Arial" w:cs="Arial"/>
-                <w:color w:val="000000"/>
-              </w:rPr>
-              <w:t xml:space="preserve">tionen am Beispiel von intelligenten Assistenten erläutern. (Wie interagieren andere Nutzer mit einem von mir geschaffenen KI-System?) </w:t>
+              <w:t xml:space="preserve">die Interaktion zwischen KI-System und menschlichen Nutzern untersuchen und personale sowie gesellschaftliche Implikationen am Beispiel von intelligenten Assistenten erläutern. (Wie interagieren andere Nutzer mit einem von mir geschaffenen KI-System?) </w:t>
             </w:r>
           </w:p>
           <w:p>
@@ -1882,7 +1988,7 @@
                 <w:right w:val="none" w:sz="0" w:space="0" w:color="000000"/>
                 <w:between w:val="none" w:sz="0" w:space="0" w:color="000000"/>
               </w:pBdr>
-              <w:spacing w:before="120" w:line="240" w:lineRule="auto"/>
+              <w:spacing w:before="120"/>
               <w:cnfStyle w:val="000000000000" w:firstRow="0" w:lastRow="0" w:firstColumn="0" w:lastColumn="0" w:oddVBand="0" w:evenVBand="0" w:oddHBand="0" w:evenHBand="0" w:firstRowFirstColumn="0" w:firstRowLastColumn="0" w:lastRowFirstColumn="0" w:lastRowLastColumn="0"/>
               <w:rPr>
                 <w:rFonts w:ascii="Arial" w:eastAsia="Arial" w:hAnsi="Arial" w:cs="Arial"/>
@@ -1894,14 +2000,7 @@
                 <w:rFonts w:ascii="Arial" w:eastAsia="Arial" w:hAnsi="Arial" w:cs="Arial"/>
                 <w:color w:val="000000"/>
               </w:rPr>
-              <w:t>Mensch-KI-Interaktionsprozesse gestalten. (Wie müssen intelligente Assistenten für eine natürliche Interaktion gestaltet</w:t>
-            </w:r>
-            <w:r>
-              <w:rPr>
-                <w:rFonts w:ascii="Arial" w:eastAsia="Arial" w:hAnsi="Arial" w:cs="Arial"/>
-                <w:color w:val="000000"/>
-              </w:rPr>
-              <w:t xml:space="preserve"> werden?)</w:t>
+              <w:t>Mensch-KI-Interaktionsprozesse gestalten. (Wie müssen intelligente Assistenten für eine natürliche Interaktion gestaltet werden?)</w:t>
             </w:r>
           </w:p>
           <w:p>
@@ -1917,7 +2016,7 @@
                 <w:right w:val="none" w:sz="0" w:space="0" w:color="000000"/>
                 <w:between w:val="none" w:sz="0" w:space="0" w:color="000000"/>
               </w:pBdr>
-              <w:spacing w:before="120" w:line="240" w:lineRule="auto"/>
+              <w:spacing w:before="120"/>
               <w:cnfStyle w:val="000000000000" w:firstRow="0" w:lastRow="0" w:firstColumn="0" w:lastColumn="0" w:oddVBand="0" w:evenVBand="0" w:oddHBand="0" w:evenHBand="0" w:firstRowFirstColumn="0" w:firstRowLastColumn="0" w:lastRowFirstColumn="0" w:lastRowLastColumn="0"/>
               <w:rPr>
                 <w:rFonts w:ascii="Arial" w:eastAsia="Arial" w:hAnsi="Arial" w:cs="Arial"/>
@@ -1929,23 +2028,51 @@
                 <w:rFonts w:ascii="Arial" w:eastAsia="Arial" w:hAnsi="Arial" w:cs="Arial"/>
                 <w:color w:val="000000"/>
               </w:rPr>
-              <w:t>beurteilen, welche Daten von einem solchen System für den Betrieb notwendig sind und welche (z.B. aus ethischen Gründen) nicht erhoben werden sollten. (Welche Daten können und sollen von einem solchen System erfasst werden? Was verraten die Daten</w:t>
-            </w:r>
-            <w:r>
-              <w:rPr>
-                <w:rFonts w:ascii="Arial" w:eastAsia="Arial" w:hAnsi="Arial" w:cs="Arial"/>
-                <w:color w:val="000000"/>
-              </w:rPr>
-              <w:t xml:space="preserve"> über mich?)</w:t>
+              <w:t>beurteilen, welche Daten von einem solchen System für den Betrieb notwendig sind und welche (z.B. aus ethischen Gründen) nicht erhoben werden sollten. (Welche Daten können und sollen von einem solchen System erfasst werden? Was verraten die Daten über mich?)</w:t>
             </w:r>
           </w:p>
         </w:tc>
       </w:tr>
       <w:tr>
+        <w:tblPrEx>
+          <w:tblW w:w="8958" w:type="dxa"/>
+          <w:tblInd w:w="0" w:type="dxa"/>
+          <w:tblBorders>
+            <w:top w:val="single" w:sz="4" w:space="0" w:color="FFC000"/>
+            <w:left w:val="single" w:sz="4" w:space="0" w:color="FFC000"/>
+            <w:bottom w:val="single" w:sz="4" w:space="0" w:color="FFC000"/>
+            <w:right w:val="single" w:sz="4" w:space="0" w:color="FFC000"/>
+            <w:insideH w:val="single" w:sz="4" w:space="0" w:color="FFC000"/>
+            <w:insideV w:val="single" w:sz="4" w:space="0" w:color="FFC000"/>
+          </w:tblBorders>
+          <w:tblLayout w:type="fixed"/>
+          <w:tblLook w:val="0480" w:firstRow="0" w:lastRow="0" w:firstColumn="1" w:lastColumn="0" w:noHBand="0" w:noVBand="1"/>
+          <w:tblPrExChange w:id="26" w:author="Imke Endjer" w:date="2023-02-23T09:57:00Z">
+            <w:tblPrEx>
+              <w:tblW w:w="8958" w:type="dxa"/>
+              <w:tblInd w:w="0" w:type="dxa"/>
+              <w:tblBorders>
+                <w:top w:val="single" w:sz="4" w:space="0" w:color="FFC000"/>
+                <w:left w:val="single" w:sz="4" w:space="0" w:color="FFC000"/>
+                <w:bottom w:val="single" w:sz="4" w:space="0" w:color="FFC000"/>
+                <w:right w:val="single" w:sz="4" w:space="0" w:color="FFC000"/>
+                <w:insideH w:val="single" w:sz="4" w:space="0" w:color="FFC000"/>
+                <w:insideV w:val="single" w:sz="4" w:space="0" w:color="FFC000"/>
+              </w:tblBorders>
+              <w:tblLayout w:type="fixed"/>
+              <w:tblLook w:val="0480" w:firstRow="0" w:lastRow="0" w:firstColumn="1" w:lastColumn="0" w:noHBand="0" w:noVBand="1"/>
+            </w:tblPrEx>
+          </w:tblPrExChange>
+        </w:tblPrEx>
         <w:tc>
           <w:tcPr>
             <w:cnfStyle w:val="001000000000" w:firstRow="0" w:lastRow="0" w:firstColumn="1" w:lastColumn="0" w:oddVBand="0" w:evenVBand="0" w:oddHBand="0" w:evenHBand="0" w:firstRowFirstColumn="0" w:firstRowLastColumn="0" w:lastRowFirstColumn="0" w:lastRowLastColumn="0"/>
-            <w:tcW w:w="3044" w:type="dxa"/>
+            <w:tcW w:w="0" w:type="dxa"/>
+            <w:tcPrChange w:id="27" w:author="Imke Endjer" w:date="2023-02-23T09:57:00Z">
+              <w:tcPr>
+                <w:tcW w:w="3044" w:type="dxa"/>
+              </w:tcPr>
+            </w:tcPrChange>
           </w:tcPr>
           <w:p>
             <w:r>
@@ -1955,8 +2082,15 @@
         </w:tc>
         <w:tc>
           <w:tcPr>
-            <w:tcW w:w="5914" w:type="dxa"/>
+            <w:tcW w:w="0" w:type="dxa"/>
             <w:gridSpan w:val="2"/>
+            <w:vAlign w:val="center"/>
+            <w:tcPrChange w:id="28" w:author="Imke Endjer" w:date="2023-02-23T09:57:00Z">
+              <w:tcPr>
+                <w:tcW w:w="5914" w:type="dxa"/>
+                <w:gridSpan w:val="2"/>
+              </w:tcPr>
+            </w:tcPrChange>
           </w:tcPr>
           <w:p>
             <w:pPr>
@@ -1971,15 +2105,40 @@
                 <w:right w:val="none" w:sz="0" w:space="0" w:color="000000"/>
                 <w:between w:val="none" w:sz="0" w:space="0" w:color="000000"/>
               </w:pBdr>
-              <w:spacing w:before="240"/>
               <w:cnfStyle w:val="000000000000" w:firstRow="0" w:lastRow="0" w:firstColumn="0" w:lastColumn="0" w:oddVBand="0" w:evenVBand="0" w:oddHBand="0" w:evenHBand="0" w:firstRowFirstColumn="0" w:firstRowLastColumn="0" w:lastRowFirstColumn="0" w:lastRowLastColumn="0"/>
               <w:rPr>
                 <w:rFonts w:ascii="Arial" w:eastAsia="Arial" w:hAnsi="Arial" w:cs="Arial"/>
-              </w:rPr>
+                <w:color w:val="000000" w:themeColor="text1"/>
+                <w:rPrChange w:id="29" w:author="Imke Endjer" w:date="2023-02-23T09:57:00Z">
+                  <w:rPr>
+                    <w:rFonts w:ascii="Arial" w:eastAsia="Arial" w:hAnsi="Arial" w:cs="Arial"/>
+                  </w:rPr>
+                </w:rPrChange>
+              </w:rPr>
+              <w:pPrChange w:id="30" w:author="Imke Endjer" w:date="2023-02-23T09:58:00Z">
+                <w:pPr>
+                  <w:numPr>
+                    <w:numId w:val="1"/>
+                  </w:numPr>
+                  <w:pBdr>
+                    <w:top w:val="none" w:sz="0" w:space="0" w:color="000000"/>
+                    <w:left w:val="none" w:sz="0" w:space="0" w:color="000000"/>
+                    <w:bottom w:val="none" w:sz="0" w:space="0" w:color="000000"/>
+                    <w:right w:val="none" w:sz="0" w:space="0" w:color="000000"/>
+                    <w:between w:val="none" w:sz="0" w:space="0" w:color="000000"/>
+                  </w:pBdr>
+                  <w:spacing w:before="240"/>
+                  <w:ind w:left="720" w:hanging="360"/>
+                  <w:cnfStyle w:val="000000000000" w:firstRow="0" w:lastRow="0" w:firstColumn="0" w:lastColumn="0" w:oddVBand="0" w:evenVBand="0" w:oddHBand="0" w:evenHBand="0" w:firstRowFirstColumn="0" w:firstRowLastColumn="0" w:lastRowFirstColumn="0" w:lastRowLastColumn="0"/>
+                </w:pPr>
+              </w:pPrChange>
             </w:pPr>
             <w:r>
               <w:rPr>
-                <w:rFonts w:ascii="Arial" w:eastAsia="Arial" w:hAnsi="Arial" w:cs="Arial"/>
+                <w:color w:val="000000" w:themeColor="text1"/>
+                <w:rPrChange w:id="31" w:author="Imke Endjer" w:date="2023-02-23T09:57:00Z">
+                  <w:rPr/>
+                </w:rPrChange>
               </w:rPr>
               <w:t>Ein Basismodul zu KI (z.B. KI-B2 oder KI-B3)</w:t>
             </w:r>
@@ -1987,10 +2146,45 @@
         </w:tc>
       </w:tr>
       <w:tr>
+        <w:tblPrEx>
+          <w:tblW w:w="8958" w:type="dxa"/>
+          <w:tblInd w:w="0" w:type="dxa"/>
+          <w:tblBorders>
+            <w:top w:val="single" w:sz="4" w:space="0" w:color="FFC000"/>
+            <w:left w:val="single" w:sz="4" w:space="0" w:color="FFC000"/>
+            <w:bottom w:val="single" w:sz="4" w:space="0" w:color="FFC000"/>
+            <w:right w:val="single" w:sz="4" w:space="0" w:color="FFC000"/>
+            <w:insideH w:val="single" w:sz="4" w:space="0" w:color="FFC000"/>
+            <w:insideV w:val="single" w:sz="4" w:space="0" w:color="FFC000"/>
+          </w:tblBorders>
+          <w:tblLayout w:type="fixed"/>
+          <w:tblLook w:val="0480" w:firstRow="0" w:lastRow="0" w:firstColumn="1" w:lastColumn="0" w:noHBand="0" w:noVBand="1"/>
+          <w:tblPrExChange w:id="32" w:author="Imke Endjer" w:date="2023-02-23T09:57:00Z">
+            <w:tblPrEx>
+              <w:tblW w:w="8958" w:type="dxa"/>
+              <w:tblInd w:w="0" w:type="dxa"/>
+              <w:tblBorders>
+                <w:top w:val="single" w:sz="4" w:space="0" w:color="FFC000"/>
+                <w:left w:val="single" w:sz="4" w:space="0" w:color="FFC000"/>
+                <w:bottom w:val="single" w:sz="4" w:space="0" w:color="FFC000"/>
+                <w:right w:val="single" w:sz="4" w:space="0" w:color="FFC000"/>
+                <w:insideH w:val="single" w:sz="4" w:space="0" w:color="FFC000"/>
+                <w:insideV w:val="single" w:sz="4" w:space="0" w:color="FFC000"/>
+              </w:tblBorders>
+              <w:tblLayout w:type="fixed"/>
+              <w:tblLook w:val="0480" w:firstRow="0" w:lastRow="0" w:firstColumn="1" w:lastColumn="0" w:noHBand="0" w:noVBand="1"/>
+            </w:tblPrEx>
+          </w:tblPrExChange>
+        </w:tblPrEx>
         <w:tc>
           <w:tcPr>
             <w:cnfStyle w:val="001000000000" w:firstRow="0" w:lastRow="0" w:firstColumn="1" w:lastColumn="0" w:oddVBand="0" w:evenVBand="0" w:oddHBand="0" w:evenHBand="0" w:firstRowFirstColumn="0" w:firstRowLastColumn="0" w:lastRowFirstColumn="0" w:lastRowLastColumn="0"/>
-            <w:tcW w:w="3044" w:type="dxa"/>
+            <w:tcW w:w="0" w:type="dxa"/>
+            <w:tcPrChange w:id="33" w:author="Imke Endjer" w:date="2023-02-23T09:57:00Z">
+              <w:tcPr>
+                <w:tcW w:w="3044" w:type="dxa"/>
+              </w:tcPr>
+            </w:tcPrChange>
           </w:tcPr>
           <w:p>
             <w:r>
@@ -2000,8 +2194,15 @@
         </w:tc>
         <w:tc>
           <w:tcPr>
-            <w:tcW w:w="5914" w:type="dxa"/>
+            <w:tcW w:w="0" w:type="dxa"/>
             <w:gridSpan w:val="2"/>
+            <w:vAlign w:val="center"/>
+            <w:tcPrChange w:id="34" w:author="Imke Endjer" w:date="2023-02-23T09:57:00Z">
+              <w:tcPr>
+                <w:tcW w:w="5914" w:type="dxa"/>
+                <w:gridSpan w:val="2"/>
+              </w:tcPr>
+            </w:tcPrChange>
           </w:tcPr>
           <w:p>
             <w:pPr>
@@ -2016,15 +2217,40 @@
                 <w:right w:val="none" w:sz="0" w:space="0" w:color="000000"/>
                 <w:between w:val="none" w:sz="0" w:space="0" w:color="000000"/>
               </w:pBdr>
-              <w:spacing w:before="120" w:line="240" w:lineRule="auto"/>
               <w:cnfStyle w:val="000000000000" w:firstRow="0" w:lastRow="0" w:firstColumn="0" w:lastColumn="0" w:oddVBand="0" w:evenVBand="0" w:oddHBand="0" w:evenHBand="0" w:firstRowFirstColumn="0" w:firstRowLastColumn="0" w:lastRowFirstColumn="0" w:lastRowLastColumn="0"/>
               <w:rPr>
                 <w:rFonts w:ascii="Arial" w:eastAsia="Arial" w:hAnsi="Arial" w:cs="Arial"/>
-              </w:rPr>
+                <w:color w:val="000000" w:themeColor="text1"/>
+                <w:rPrChange w:id="35" w:author="Imke Endjer" w:date="2023-02-23T09:57:00Z">
+                  <w:rPr>
+                    <w:rFonts w:ascii="Arial" w:eastAsia="Arial" w:hAnsi="Arial" w:cs="Arial"/>
+                  </w:rPr>
+                </w:rPrChange>
+              </w:rPr>
+              <w:pPrChange w:id="36" w:author="Imke Endjer" w:date="2023-02-23T09:58:00Z">
+                <w:pPr>
+                  <w:numPr>
+                    <w:numId w:val="2"/>
+                  </w:numPr>
+                  <w:pBdr>
+                    <w:top w:val="none" w:sz="0" w:space="0" w:color="000000"/>
+                    <w:left w:val="none" w:sz="0" w:space="0" w:color="000000"/>
+                    <w:bottom w:val="none" w:sz="0" w:space="0" w:color="000000"/>
+                    <w:right w:val="none" w:sz="0" w:space="0" w:color="000000"/>
+                    <w:between w:val="none" w:sz="0" w:space="0" w:color="000000"/>
+                  </w:pBdr>
+                  <w:spacing w:before="120"/>
+                  <w:ind w:left="720" w:hanging="360"/>
+                  <w:cnfStyle w:val="000000000000" w:firstRow="0" w:lastRow="0" w:firstColumn="0" w:lastColumn="0" w:oddVBand="0" w:evenVBand="0" w:oddHBand="0" w:evenHBand="0" w:firstRowFirstColumn="0" w:firstRowLastColumn="0" w:lastRowFirstColumn="0" w:lastRowLastColumn="0"/>
+                </w:pPr>
+              </w:pPrChange>
             </w:pPr>
             <w:r>
               <w:rPr>
-                <w:rFonts w:ascii="Arial" w:eastAsia="Arial" w:hAnsi="Arial" w:cs="Arial"/>
+                <w:color w:val="000000" w:themeColor="text1"/>
+                <w:rPrChange w:id="37" w:author="Imke Endjer" w:date="2023-02-23T09:57:00Z">
+                  <w:rPr/>
+                </w:rPrChange>
               </w:rPr>
               <w:t>Ein Basismodul zu KI (z.B. KI-B2 oder KI-B3), erste Erfahrungen mit Snap!</w:t>
             </w:r>
@@ -2075,7 +2301,7 @@
                 <w:right w:val="none" w:sz="0" w:space="0" w:color="000000"/>
                 <w:between w:val="none" w:sz="0" w:space="0" w:color="000000"/>
               </w:pBdr>
-              <w:spacing w:before="120" w:line="240" w:lineRule="auto"/>
+              <w:spacing w:before="120"/>
               <w:cnfStyle w:val="000000000000" w:firstRow="0" w:lastRow="0" w:firstColumn="0" w:lastColumn="0" w:oddVBand="0" w:evenVBand="0" w:oddHBand="0" w:evenHBand="0" w:firstRowFirstColumn="0" w:firstRowLastColumn="0" w:lastRowFirstColumn="0" w:lastRowLastColumn="0"/>
               <w:rPr>
                 <w:rFonts w:ascii="Arial" w:eastAsia="Arial" w:hAnsi="Arial" w:cs="Arial"/>
@@ -2131,7 +2357,7 @@
                 <w:right w:val="none" w:sz="0" w:space="0" w:color="000000"/>
                 <w:between w:val="none" w:sz="0" w:space="0" w:color="000000"/>
               </w:pBdr>
-              <w:spacing w:before="120" w:line="240" w:lineRule="auto"/>
+              <w:spacing w:before="120"/>
               <w:cnfStyle w:val="000000000000" w:firstRow="0" w:lastRow="0" w:firstColumn="0" w:lastColumn="0" w:oddVBand="0" w:evenVBand="0" w:oddHBand="0" w:evenHBand="0" w:firstRowFirstColumn="0" w:firstRowLastColumn="0" w:lastRowFirstColumn="0" w:lastRowLastColumn="0"/>
               <w:rPr>
                 <w:rFonts w:ascii="Arial" w:eastAsia="Arial" w:hAnsi="Arial" w:cs="Arial"/>
@@ -2158,7 +2384,7 @@
                 <w:right w:val="none" w:sz="0" w:space="0" w:color="000000"/>
                 <w:between w:val="none" w:sz="0" w:space="0" w:color="000000"/>
               </w:pBdr>
-              <w:spacing w:before="120" w:line="240" w:lineRule="auto"/>
+              <w:spacing w:before="120"/>
               <w:cnfStyle w:val="000000000000" w:firstRow="0" w:lastRow="0" w:firstColumn="0" w:lastColumn="0" w:oddVBand="0" w:evenVBand="0" w:oddHBand="0" w:evenHBand="0" w:firstRowFirstColumn="0" w:firstRowLastColumn="0" w:lastRowFirstColumn="0" w:lastRowLastColumn="0"/>
               <w:rPr>
                 <w:rFonts w:ascii="Arial" w:eastAsia="Arial" w:hAnsi="Arial" w:cs="Arial"/>
@@ -2183,38 +2409,29 @@
           <w:numId w:val="3"/>
         </w:numPr>
       </w:pPr>
-      <w:bookmarkStart w:id="4" w:name="_Toc103785170"/>
+      <w:bookmarkStart w:id="38" w:name="_Toc103785170"/>
       <w:r>
+        <w:lastRenderedPageBreak/>
         <w:t>Warum gibt es das Modul?</w:t>
       </w:r>
-      <w:bookmarkEnd w:id="4"/>
+      <w:bookmarkEnd w:id="38"/>
     </w:p>
     <w:p>
       <w:pPr>
         <w:tabs>
           <w:tab w:val="left" w:pos="5029"/>
         </w:tabs>
+        <w:jc w:val="both"/>
+        <w:pPrChange w:id="39" w:author="Imke Endjer" w:date="2023-02-23T09:58:00Z">
+          <w:pPr>
+            <w:tabs>
+              <w:tab w:val="left" w:pos="5029"/>
+            </w:tabs>
+          </w:pPr>
+        </w:pPrChange>
       </w:pPr>
       <w:r>
-        <w:t xml:space="preserve">Informatik ist eine kreative Disziplin. Daher </w:t>
-      </w:r>
-      <w:r>
-        <w:t xml:space="preserve">sollen die Schülerinnen und Schüler ihren Fokus auf die Gestaltung und Nutzung von KI für ihren intelligenten Assistenten legen können. In diesem Modul entwerfen die Schülerinnen und Schüler daher zunächst eine eigene Persönlichkeit und implementieren sie </w:t>
-      </w:r>
-      <w:r>
-        <w:t>anschließend in Snap!. Durch eine Kopplung zwischen Smartphone und Snap! kann der digitale Assistent über das Smartphone gesteuert werden. Das Smartphone kann anschließend gemäß der Persönlichkeit „verkleidet“ werden. Hierfür können sämtliche Bastelmateria</w:t>
-      </w:r>
-      <w:r>
-        <w:t xml:space="preserve">lien (z.B. ein alter Schuhkarton, Luftballons, Legosteine) genutzt werden. Für die Verkleidung des Smartphones steht auch eine Vorlage für Papierbögen zur Verfügung, die geschnitten und gefaltet, als modulare Bausteine für den Assistenten verwendet werden </w:t>
-      </w:r>
-      <w:r>
-        <w:t>können. So lernen die Schülerinnen und Schüler, wie Künstliche Intelligenz genutzt werden kann, um eigene Anwendungen und Produkte zu kreieren. Ein solcher Ansatz der Gestaltung von Kommunikation zwischen Mensch und Maschine hat im Vergleich zu rein auf Ch</w:t>
-      </w:r>
-      <w:r>
-        <w:t>atbot-basierenden Unterrichtsszenarien den Vorteil, dass neben der Thematisierung von Aspekten der Gestaltung von KI-Schnittstellen auch das Zusammenspiel unterschiedlicher Verfahren zum Erreichen einer „überzeugenderen” Künstlichen Intelligenz erlebbar wi</w:t>
-      </w:r>
-      <w:r>
-        <w:t>rd.</w:t>
+        <w:t>Informatik ist eine kreative Disziplin. Daher sollen die Schülerinnen und Schüler ihren Fokus auf die Gestaltung und Nutzung von KI für ihren intelligenten Assistenten legen können. In diesem Modul entwerfen die Schülerinnen und Schüler daher zunächst eine eigene Persönlichkeit und implementieren sie anschließend in Snap!. Durch eine Kopplung zwischen Smartphone und Snap! kann der digitale Assistent über das Smartphone gesteuert werden. Das Smartphone kann anschließend gemäß der Persönlichkeit „verkleidet“ werden. Hierfür können sämtliche Bastelmaterialien (z.B. ein alter Schuhkarton, Luftballons, Legosteine) genutzt werden. Für die Verkleidung des Smartphones steht auch eine Vorlage für Papierbögen zur Verfügung, die geschnitten und gefaltet, als modulare Bausteine für den Assistenten verwendet werden können. So lernen die Schülerinnen und Schüler, wie Künstliche Intelligenz genutzt werden kann, um eigene Anwendungen und Produkte zu kreieren. Ein solcher Ansatz der Gestaltung von Kommunikation zwischen Mensch und Maschine hat im Vergleich zu rein auf Chatbot-basierenden Unterrichtsszenarien den Vorteil, dass neben der Thematisierung von Aspekten der Gestaltung von KI-Schnittstellen auch das Zusammenspiel unterschiedlicher Verfahren zum Erreichen einer „überzeugenderen” Künstlichen Intelligenz erlebbar wird.</w:t>
       </w:r>
     </w:p>
     <w:p>
@@ -2222,10 +2439,7 @@
         <w:jc w:val="both"/>
       </w:pPr>
       <w:r>
-        <w:t>Dem selbst gestalteten Assistenten können die Schülerinnen und Schüler anschließend per Smartphone eine eigene Identität verleihen und mit dem Computer unter Nutzung des zu entwickelnden Frameworks koppeln, sodass eigenes Verhalten und eigene Reaktione</w:t>
-      </w:r>
-      <w:r>
-        <w:t>n implementiert werden können.</w:t>
+        <w:t>Dem selbst gestalteten Assistenten können die Schülerinnen und Schüler anschließend per Smartphone eine eigene Identität verleihen und mit dem Computer unter Nutzung des zu entwickelnden Frameworks koppeln, sodass eigenes Verhalten und eigene Reaktionen implementiert werden können.</w:t>
       </w:r>
     </w:p>
     <w:p>
@@ -2235,16 +2449,35 @@
           <w:ilvl w:val="0"/>
           <w:numId w:val="3"/>
         </w:numPr>
+        <w:jc w:val="both"/>
+        <w:pPrChange w:id="40" w:author="Imke Endjer" w:date="2023-02-23T09:59:00Z">
+          <w:pPr>
+            <w:pStyle w:val="berschrift1"/>
+            <w:numPr>
+              <w:numId w:val="3"/>
+            </w:numPr>
+            <w:tabs>
+              <w:tab w:val="clear" w:pos="720"/>
+            </w:tabs>
+            <w:ind w:left="432" w:hanging="432"/>
+          </w:pPr>
+        </w:pPrChange>
       </w:pPr>
-      <w:bookmarkStart w:id="5" w:name="_Toc103785171"/>
+      <w:bookmarkStart w:id="41" w:name="_Toc103785171"/>
       <w:r>
         <w:t>Ziele des Moduls</w:t>
       </w:r>
-      <w:bookmarkEnd w:id="5"/>
+      <w:bookmarkEnd w:id="41"/>
     </w:p>
     <w:p>
       <w:pPr>
         <w:spacing w:after="0" w:line="276" w:lineRule="auto"/>
+        <w:jc w:val="both"/>
+        <w:pPrChange w:id="42" w:author="Imke Endjer" w:date="2023-02-23T09:59:00Z">
+          <w:pPr>
+            <w:spacing w:after="0" w:line="276" w:lineRule="auto"/>
+          </w:pPr>
+        </w:pPrChange>
       </w:pPr>
       <w:r>
         <w:t xml:space="preserve">Das Modul leistet folgende Beiträge zu den </w:t>
@@ -2265,6 +2498,16 @@
           <w:numId w:val="6"/>
         </w:numPr>
         <w:spacing w:after="0" w:line="276" w:lineRule="auto"/>
+        <w:jc w:val="both"/>
+        <w:pPrChange w:id="43" w:author="Imke Endjer" w:date="2023-02-23T09:59:00Z">
+          <w:pPr>
+            <w:numPr>
+              <w:numId w:val="6"/>
+            </w:numPr>
+            <w:spacing w:after="0" w:line="276" w:lineRule="auto"/>
+            <w:ind w:left="720" w:hanging="360"/>
+          </w:pPr>
+        </w:pPrChange>
       </w:pPr>
       <w:r>
         <w:t>Aus technologischer Perspektive werden in diesem Modul Denk- und Arbeitsweisen für die kreative Gestaltung von KI-Systemen erworben und Herausforderungen der Mensch-Maschine-Interaktion ergründet.</w:t>
@@ -2277,12 +2520,19 @@
           <w:numId w:val="6"/>
         </w:numPr>
         <w:spacing w:after="0" w:line="276" w:lineRule="auto"/>
+        <w:jc w:val="both"/>
+        <w:pPrChange w:id="44" w:author="Imke Endjer" w:date="2023-02-23T09:59:00Z">
+          <w:pPr>
+            <w:numPr>
+              <w:numId w:val="6"/>
+            </w:numPr>
+            <w:spacing w:after="0" w:line="276" w:lineRule="auto"/>
+            <w:ind w:left="720" w:hanging="360"/>
+          </w:pPr>
+        </w:pPrChange>
       </w:pPr>
       <w:r>
-        <w:t>Aus Anwendungsperspektive beschäftigen sich die Schülerinne</w:t>
-      </w:r>
-      <w:r>
-        <w:t>n und Schüler mit KI-Anwendungen in den Sprachwissenschaften sowie der Nutzung von KI im Alltag.</w:t>
+        <w:t>Aus Anwendungsperspektive beschäftigen sich die Schülerinnen und Schüler mit KI-Anwendungen in den Sprachwissenschaften sowie der Nutzung von KI im Alltag.</w:t>
       </w:r>
     </w:p>
     <w:p>
@@ -2292,15 +2542,28 @@
           <w:numId w:val="6"/>
         </w:numPr>
         <w:spacing w:after="0" w:line="276" w:lineRule="auto"/>
+        <w:jc w:val="both"/>
+        <w:pPrChange w:id="45" w:author="Imke Endjer" w:date="2023-02-23T09:59:00Z">
+          <w:pPr>
+            <w:numPr>
+              <w:numId w:val="6"/>
+            </w:numPr>
+            <w:spacing w:after="0" w:line="276" w:lineRule="auto"/>
+            <w:ind w:left="720" w:hanging="360"/>
+          </w:pPr>
+        </w:pPrChange>
       </w:pPr>
       <w:r>
-        <w:t>Aus gesellschaftlich-kultureller Perspektive werden persönliche Konsequenzen aus dem Einsatz von KI-Systemen diskutiert, Entscheidungen zur Gestaltung von Mens</w:t>
-      </w:r>
-      <w:r>
-        <w:t>ch-KI-Interaktionen getroffen und relevante Aspekte des Datenschutzes aus Sicht von KI-Anwendungen thematisiert.</w:t>
+        <w:t>Aus gesellschaftlich-kultureller Perspektive werden persönliche Konsequenzen aus dem Einsatz von KI-Systemen diskutiert, Entscheidungen zur Gestaltung von Mensch-KI-Interaktionen getroffen und relevante Aspekte des Datenschutzes aus Sicht von KI-Anwendungen thematisiert.</w:t>
       </w:r>
     </w:p>
     <w:p>
+      <w:pPr>
+        <w:jc w:val="both"/>
+        <w:pPrChange w:id="46" w:author="Imke Endjer" w:date="2023-02-23T09:59:00Z">
+          <w:pPr/>
+        </w:pPrChange>
+      </w:pPr>
       <w:r>
         <w:br w:type="page"/>
       </w:r>
@@ -2313,22 +2576,20 @@
           <w:numId w:val="3"/>
         </w:numPr>
       </w:pPr>
-      <w:bookmarkStart w:id="6" w:name="_Toc103785172"/>
+      <w:bookmarkStart w:id="47" w:name="_Toc103785172"/>
       <w:r>
+        <w:lastRenderedPageBreak/>
         <w:t xml:space="preserve">Die Rolle der Unternehmensvertreterin/des </w:t>
       </w:r>
       <w:r>
         <w:br/>
         <w:t>Unternehmensvertreters</w:t>
       </w:r>
-      <w:bookmarkEnd w:id="6"/>
+      <w:bookmarkEnd w:id="47"/>
     </w:p>
     <w:p>
       <w:r>
-        <w:t>In diesem Modul hat die Unternehmensvertreterin bzw. der Unternehmensvertrete</w:t>
-      </w:r>
-      <w:r>
-        <w:t>r mehrere Möglichkeiten aktiv mitzuwirken. Hier einige Anregungen:</w:t>
+        <w:t>In diesem Modul hat die Unternehmensvertreterin bzw. der Unternehmensvertreter mehrere Möglichkeiten aktiv mitzuwirken. Hier einige Anregungen:</w:t>
       </w:r>
     </w:p>
     <w:p>
@@ -2366,10 +2627,7 @@
         <w:spacing w:before="120" w:after="120"/>
       </w:pPr>
       <w:r>
-        <w:t xml:space="preserve">Schülerinnen und Schülern eine Exkursion in </w:t>
-      </w:r>
-      <w:r>
-        <w:t>das eigene Unternehmen ermöglichen und zeigen, wie Künstliche Intelligenz in der Praxis eingesetzt wird</w:t>
+        <w:t>Schülerinnen und Schülern eine Exkursion in das eigene Unternehmen ermöglichen und zeigen, wie Künstliche Intelligenz in der Praxis eingesetzt wird</w:t>
       </w:r>
     </w:p>
     <w:p>
@@ -2401,10 +2659,7 @@
       </w:r>
       <w:proofErr w:type="spellEnd"/>
       <w:r>
-        <w:t xml:space="preserve"> des eigenen Unternehmens organisieren, die berichten, warum sie sich für ein Studium im Ber</w:t>
-      </w:r>
-      <w:r>
-        <w:t>eich Informatik / Data Science entschieden haben</w:t>
+        <w:t xml:space="preserve"> des eigenen Unternehmens organisieren, die berichten, warum sie sich für ein Studium im Bereich Informatik / Data Science entschieden haben</w:t>
       </w:r>
     </w:p>
     <w:p>
@@ -2423,10 +2678,7 @@
         <w:spacing w:before="120" w:after="120"/>
       </w:pPr>
       <w:r>
-        <w:t>„Kreativworkshop“ / „Wettbewerb“ ausrichten, wie das Gelernte im Alltag der Schülerinnen und Schüler eingesetzt werden könnte und nach bestimmten Bewertungskriterien (Kreativität, Umsetzbarkeit, Innovationsg</w:t>
-      </w:r>
-      <w:r>
-        <w:t>rad…) die entwickelten bzw. eingereichten Ideen bewerten</w:t>
+        <w:t>„Kreativworkshop“ / „Wettbewerb“ ausrichten, wie das Gelernte im Alltag der Schülerinnen und Schüler eingesetzt werden könnte und nach bestimmten Bewertungskriterien (Kreativität, Umsetzbarkeit, Innovationsgrad…) die entwickelten bzw. eingereichten Ideen bewerten</w:t>
       </w:r>
     </w:p>
     <w:p>
@@ -2459,27 +2711,18 @@
           <w:numId w:val="3"/>
         </w:numPr>
       </w:pPr>
-      <w:bookmarkStart w:id="7" w:name="_Toc103785173"/>
+      <w:bookmarkStart w:id="48" w:name="_Toc103785173"/>
       <w:r>
         <w:t>Inhalte des Moduls</w:t>
       </w:r>
-      <w:bookmarkEnd w:id="7"/>
+      <w:bookmarkEnd w:id="48"/>
     </w:p>
     <w:p>
       <w:pPr>
         <w:jc w:val="both"/>
       </w:pPr>
       <w:r>
-        <w:t xml:space="preserve">Sprachassistenten erleichtern uns den Alltag. Dabei werden mehrere Algorithmen (z.B. </w:t>
-      </w:r>
-      <w:r>
-        <w:t>zur Auswahl einer geeigneten Reaktion) und KI-Systeme (z.B. zur Erkennung von Sprache oder zur Generierung von Sprache) kombiniert, um eine möglichst reibungslose Kommunikation zu gewährleisten. Aufgabe der Schülerinnen und Schüler ist es, in die Rolle von</w:t>
-      </w:r>
-      <w:r>
-        <w:t xml:space="preserve"> Entwicklerinnen und Entwicklern zu schlüpfen. Sie sollen die Schnittstelle zwischen Mensch und Maschine möglichst natürlich gestalten und die Bedienung so einfach wie möglich machen. Dazu kann auf bestimmte Formulierungen, Humor oder auch auf Mimik zurück</w:t>
-      </w:r>
-      <w:r>
-        <w:t xml:space="preserve">gegriffen werden. </w:t>
+        <w:t xml:space="preserve">Sprachassistenten erleichtern uns den Alltag. Dabei werden mehrere Algorithmen (z.B. zur Auswahl einer geeigneten Reaktion) und KI-Systeme (z.B. zur Erkennung von Sprache oder zur Generierung von Sprache) kombiniert, um eine möglichst reibungslose Kommunikation zu gewährleisten. Aufgabe der Schülerinnen und Schüler ist es, in die Rolle von Entwicklerinnen und Entwicklern zu schlüpfen. Sie sollen die Schnittstelle zwischen Mensch und Maschine möglichst natürlich gestalten und die Bedienung so einfach wie möglich machen. Dazu kann auf bestimmte Formulierungen, Humor oder auch auf Mimik zurückgegriffen werden. </w:t>
       </w:r>
     </w:p>
     <w:p>
@@ -2502,13 +2745,7 @@
         </w:r>
       </w:hyperlink>
       <w:r>
-        <w:t xml:space="preserve"> </w:t>
-      </w:r>
-      <w:r>
-        <w:t>mit dem eigenen Smartphone zu öffnen und denselben Verbindungscode wie in der Progr</w:t>
-      </w:r>
-      <w:r>
-        <w:t>ammierumgebung Snap! einzugeben. Folgende neue Blöcke wurden zu Snap! hinzugefügt, die in eigenen Projekten verwendet werden können:</w:t>
+        <w:t xml:space="preserve"> mit dem eigenen Smartphone zu öffnen und denselben Verbindungscode wie in der Programmierumgebung Snap! einzugeben. Folgende neue Blöcke wurden zu Snap! hinzugefügt, die in eigenen Projekten verwendet werden können:</w:t>
       </w:r>
     </w:p>
     <w:tbl>
@@ -2552,7 +2789,6 @@
           </w:tcPr>
           <w:p>
             <w:pPr>
-              <w:spacing w:line="240" w:lineRule="auto"/>
               <w:jc w:val="center"/>
               <w:rPr>
                 <w:rFonts w:ascii="Arial" w:eastAsia="Arial" w:hAnsi="Arial" w:cs="Arial"/>
@@ -2564,7 +2800,6 @@
               <w:rPr>
                 <w:rFonts w:ascii="Arial" w:eastAsia="Arial" w:hAnsi="Arial" w:cs="Arial"/>
                 <w:b/>
-                <w:sz w:val="20"/>
               </w:rPr>
               <w:t>Block</w:t>
             </w:r>
@@ -2590,7 +2825,6 @@
           </w:tcPr>
           <w:p>
             <w:pPr>
-              <w:spacing w:line="240" w:lineRule="auto"/>
               <w:jc w:val="center"/>
               <w:rPr>
                 <w:rFonts w:ascii="Arial" w:eastAsia="Arial" w:hAnsi="Arial" w:cs="Arial"/>
@@ -2602,7 +2836,6 @@
               <w:rPr>
                 <w:rFonts w:ascii="Arial" w:eastAsia="Arial" w:hAnsi="Arial" w:cs="Arial"/>
                 <w:b/>
-                <w:sz w:val="20"/>
               </w:rPr>
               <w:t>Erläuterung</w:t>
             </w:r>
@@ -2628,7 +2861,6 @@
           </w:tcPr>
           <w:p>
             <w:pPr>
-              <w:spacing w:line="240" w:lineRule="auto"/>
               <w:rPr>
                 <w:rFonts w:ascii="Arial" w:eastAsia="Arial" w:hAnsi="Arial" w:cs="Arial"/>
                 <w:sz w:val="24"/>
@@ -2697,7 +2929,6 @@
           </w:tcPr>
           <w:p>
             <w:pPr>
-              <w:spacing w:line="240" w:lineRule="auto"/>
               <w:rPr>
                 <w:rFonts w:ascii="Arial" w:eastAsia="Arial" w:hAnsi="Arial" w:cs="Arial"/>
               </w:rPr>
@@ -2731,7 +2962,6 @@
           </w:tcPr>
           <w:p>
             <w:pPr>
-              <w:spacing w:line="240" w:lineRule="auto"/>
               <w:rPr>
                 <w:rFonts w:ascii="Arial" w:eastAsia="Arial" w:hAnsi="Arial" w:cs="Arial"/>
                 <w:sz w:val="24"/>
@@ -2801,7 +3031,6 @@
           </w:tcPr>
           <w:p>
             <w:pPr>
-              <w:spacing w:line="240" w:lineRule="auto"/>
               <w:rPr>
                 <w:rFonts w:ascii="Arial" w:eastAsia="Arial" w:hAnsi="Arial" w:cs="Arial"/>
               </w:rPr>
@@ -2823,13 +3052,7 @@
               <w:rPr>
                 <w:rFonts w:ascii="Arial" w:eastAsia="Arial" w:hAnsi="Arial" w:cs="Arial"/>
               </w:rPr>
-              <w:t>-Projekt mit einem Raum, über den</w:t>
-            </w:r>
-            <w:r>
-              <w:rPr>
-                <w:rFonts w:ascii="Arial" w:eastAsia="Arial" w:hAnsi="Arial" w:cs="Arial"/>
-              </w:rPr>
-              <w:t xml:space="preserve"> Nachrichten zwischen Smartphone und Snap</w:t>
+              <w:t>-Projekt mit einem Raum, über den Nachrichten zwischen Smartphone und Snap</w:t>
             </w:r>
             <w:r>
               <w:rPr>
@@ -2866,7 +3089,6 @@
           </w:tcPr>
           <w:p>
             <w:pPr>
-              <w:spacing w:line="240" w:lineRule="auto"/>
               <w:rPr>
                 <w:rFonts w:ascii="Arial" w:eastAsia="Arial" w:hAnsi="Arial" w:cs="Arial"/>
                 <w:sz w:val="24"/>
@@ -2977,7 +3199,6 @@
           </w:tcPr>
           <w:p>
             <w:pPr>
-              <w:spacing w:line="240" w:lineRule="auto"/>
               <w:rPr>
                 <w:rFonts w:ascii="Arial" w:eastAsia="Arial" w:hAnsi="Arial" w:cs="Arial"/>
               </w:rPr>
@@ -3011,7 +3232,6 @@
           </w:tcPr>
           <w:p>
             <w:pPr>
-              <w:spacing w:line="240" w:lineRule="auto"/>
               <w:rPr>
                 <w:rFonts w:ascii="Arial" w:eastAsia="Arial" w:hAnsi="Arial" w:cs="Arial"/>
                 <w:sz w:val="24"/>
@@ -3081,7 +3301,6 @@
           </w:tcPr>
           <w:p>
             <w:pPr>
-              <w:spacing w:line="240" w:lineRule="auto"/>
               <w:rPr>
                 <w:rFonts w:ascii="Arial" w:eastAsia="Arial" w:hAnsi="Arial" w:cs="Arial"/>
               </w:rPr>
@@ -3090,7 +3309,14 @@
               <w:rPr>
                 <w:rFonts w:ascii="Arial" w:eastAsia="Arial" w:hAnsi="Arial" w:cs="Arial"/>
               </w:rPr>
-              <w:t>Dieser Block verändert die Emotion bzw. den Gesichtsausdruck des Assistenten auf eine der vorgegebenen Varianten. Damit der Block funktioniert, muss eine Verbindung mit dem Assistenten hergestellt worden sein</w:t>
+              <w:t xml:space="preserve">Dieser Block verändert die Emotion bzw. den Gesichtsausdruck des Assistenten auf eine der vorgegebenen Varianten. Damit der Block funktioniert, </w:t>
+            </w:r>
+            <w:r>
+              <w:rPr>
+                <w:rFonts w:ascii="Arial" w:eastAsia="Arial" w:hAnsi="Arial" w:cs="Arial"/>
+              </w:rPr>
+              <w:lastRenderedPageBreak/>
+              <w:t>muss eine Verbindung mit dem Assistenten hergestellt worden sein</w:t>
             </w:r>
           </w:p>
         </w:tc>
@@ -3114,7 +3340,6 @@
           </w:tcPr>
           <w:p>
             <w:pPr>
-              <w:spacing w:line="240" w:lineRule="auto"/>
               <w:rPr>
                 <w:rFonts w:ascii="Arial" w:eastAsia="Arial" w:hAnsi="Arial" w:cs="Arial"/>
                 <w:sz w:val="24"/>
@@ -3127,6 +3352,7 @@
                 <w:sz w:val="24"/>
                 <w:szCs w:val="24"/>
               </w:rPr>
+              <w:lastRenderedPageBreak/>
               <w:drawing>
                 <wp:inline distT="0" distB="0" distL="0" distR="0" wp14:anchorId="6E2AB0A9" wp14:editId="76C8276C">
                   <wp:extent cx="2181225" cy="520700"/>
@@ -3183,7 +3409,6 @@
           </w:tcPr>
           <w:p>
             <w:pPr>
-              <w:spacing w:line="240" w:lineRule="auto"/>
               <w:rPr>
                 <w:rFonts w:ascii="Arial" w:eastAsia="Arial" w:hAnsi="Arial" w:cs="Arial"/>
               </w:rPr>
@@ -3192,13 +3417,7 @@
               <w:rPr>
                 <w:rFonts w:ascii="Arial" w:eastAsia="Arial" w:hAnsi="Arial" w:cs="Arial"/>
               </w:rPr>
-              <w:t>Diese Blöcke sind für Training eines Modells verantwortlich. Der Block “erstelle Klassifikator” steht dabei am Anfang und legt die verwendete Datenstruktur an. Mit dem Block “Trainiere Klassifikator mit Liste: () Kategorie: ()” wird das Modell überwacht tr</w:t>
-            </w:r>
-            <w:r>
-              <w:rPr>
-                <w:rFonts w:ascii="Arial" w:eastAsia="Arial" w:hAnsi="Arial" w:cs="Arial"/>
-              </w:rPr>
-              <w:t>ainiert, wobei die Liste die Trainingsdaten darstellt und die Kategorie die zugehörige Beschriftung.</w:t>
+              <w:t>Diese Blöcke sind für Training eines Modells verantwortlich. Der Block “erstelle Klassifikator” steht dabei am Anfang und legt die verwendete Datenstruktur an. Mit dem Block “Trainiere Klassifikator mit Liste: () Kategorie: ()” wird das Modell überwacht trainiert, wobei die Liste die Trainingsdaten darstellt und die Kategorie die zugehörige Beschriftung.</w:t>
             </w:r>
           </w:p>
         </w:tc>
@@ -3244,7 +3463,6 @@
           </w:tcPr>
           <w:p>
             <w:pPr>
-              <w:spacing w:line="240" w:lineRule="auto"/>
               <w:rPr>
                 <w:rFonts w:ascii="Arial" w:eastAsia="Arial" w:hAnsi="Arial" w:cs="Arial"/>
                 <w:sz w:val="24"/>
@@ -3315,7 +3533,6 @@
           </w:tcPr>
           <w:p>
             <w:pPr>
-              <w:spacing w:line="240" w:lineRule="auto"/>
               <w:rPr>
                 <w:rFonts w:ascii="Arial" w:eastAsia="Arial" w:hAnsi="Arial" w:cs="Arial"/>
               </w:rPr>
@@ -3348,16 +3565,13 @@
           </w:tcPr>
           <w:p>
             <w:pPr>
-              <w:spacing w:line="240" w:lineRule="auto"/>
               <w:rPr>
                 <w:rFonts w:ascii="Arial" w:eastAsia="Arial" w:hAnsi="Arial" w:cs="Arial"/>
-                <w:sz w:val="20"/>
               </w:rPr>
             </w:pPr>
             <w:r>
               <w:rPr>
                 <w:noProof/>
-                <w:sz w:val="20"/>
               </w:rPr>
               <w:drawing>
                 <wp:inline distT="0" distB="0" distL="0" distR="0" wp14:anchorId="16349330" wp14:editId="79FF54D4">
@@ -3415,7 +3629,6 @@
           </w:tcPr>
           <w:p>
             <w:pPr>
-              <w:spacing w:line="240" w:lineRule="auto"/>
               <w:rPr>
                 <w:rFonts w:ascii="Arial" w:eastAsia="Arial" w:hAnsi="Arial" w:cs="Arial"/>
               </w:rPr>
@@ -3449,16 +3662,13 @@
           </w:tcPr>
           <w:p>
             <w:pPr>
-              <w:spacing w:line="240" w:lineRule="auto"/>
               <w:rPr>
                 <w:rFonts w:ascii="Arial" w:eastAsia="Arial" w:hAnsi="Arial" w:cs="Arial"/>
-                <w:sz w:val="20"/>
               </w:rPr>
             </w:pPr>
             <w:r>
               <w:rPr>
                 <w:noProof/>
-                <w:sz w:val="20"/>
               </w:rPr>
               <w:drawing>
                 <wp:inline distT="0" distB="0" distL="0" distR="0" wp14:anchorId="5366324A" wp14:editId="12A422AB">
@@ -3517,7 +3727,6 @@
           </w:tcPr>
           <w:p>
             <w:pPr>
-              <w:spacing w:line="240" w:lineRule="auto"/>
               <w:rPr>
                 <w:rFonts w:ascii="Arial" w:eastAsia="Arial" w:hAnsi="Arial" w:cs="Arial"/>
               </w:rPr>
@@ -3539,28 +3748,556 @@
           <w:ilvl w:val="0"/>
           <w:numId w:val="3"/>
         </w:numPr>
+        <w:rPr>
+          <w:ins w:id="49" w:author="Imke Endjer" w:date="2023-02-23T10:57:00Z"/>
+        </w:rPr>
       </w:pPr>
-      <w:bookmarkStart w:id="8" w:name="_Toc103785174"/>
+      <w:bookmarkStart w:id="50" w:name="_Toc103785174"/>
       <w:r>
         <w:t>Unterrichtliche Umsetzung</w:t>
       </w:r>
-      <w:bookmarkEnd w:id="8"/>
+      <w:bookmarkEnd w:id="50"/>
+    </w:p>
+    <w:p>
+      <w:pPr>
+        <w:ind w:right="452"/>
+        <w:jc w:val="both"/>
+        <w:rPr>
+          <w:ins w:id="51" w:author="Imke Endjer" w:date="2023-02-23T10:53:00Z"/>
+        </w:rPr>
+        <w:pPrChange w:id="52" w:author="Imke Endjer" w:date="2023-02-23T11:01:00Z">
+          <w:pPr>
+            <w:pStyle w:val="berschrift1"/>
+            <w:numPr>
+              <w:numId w:val="3"/>
+            </w:numPr>
+            <w:tabs>
+              <w:tab w:val="clear" w:pos="720"/>
+            </w:tabs>
+            <w:ind w:left="432" w:hanging="432"/>
+          </w:pPr>
+        </w:pPrChange>
+      </w:pPr>
+      <w:ins w:id="53" w:author="Imke Endjer" w:date="2023-02-23T10:58:00Z">
+        <w:r>
+          <w:t xml:space="preserve">In diesem Modul geht es um das explorieren und </w:t>
+        </w:r>
+        <w:proofErr w:type="spellStart"/>
+        <w:r>
+          <w:t>erstellen</w:t>
+        </w:r>
+        <w:proofErr w:type="spellEnd"/>
+        <w:r>
+          <w:t xml:space="preserve"> eines </w:t>
+        </w:r>
+      </w:ins>
+      <w:ins w:id="54" w:author="Imke Endjer" w:date="2023-02-23T11:12:00Z">
+        <w:r>
+          <w:t>digitalen persönlichen Assistenten</w:t>
+        </w:r>
+      </w:ins>
+      <w:ins w:id="55" w:author="Imke Endjer" w:date="2023-02-23T10:58:00Z">
+        <w:r>
+          <w:t xml:space="preserve"> mit dem Smartphone und der Verwendung von Snap!.  </w:t>
+        </w:r>
+      </w:ins>
+      <w:ins w:id="56" w:author="Imke Endjer" w:date="2023-02-23T10:57:00Z">
+        <w:r>
+          <w:t xml:space="preserve">Diese Unterrichtseinheit folgt dem Use-Modify-Create-Konzept. </w:t>
+        </w:r>
+      </w:ins>
+      <w:ins w:id="57" w:author="Imke Endjer" w:date="2023-02-23T10:58:00Z">
+        <w:r>
+          <w:t>Zu</w:t>
+        </w:r>
+      </w:ins>
+      <w:ins w:id="58" w:author="Imke Endjer" w:date="2023-02-23T10:59:00Z">
+        <w:r>
+          <w:t>nächst erhalten die Schüler</w:t>
+        </w:r>
+      </w:ins>
+      <w:ins w:id="59" w:author="Imke Endjer" w:date="2023-02-23T11:00:00Z">
+        <w:r>
+          <w:t>innen und Schüler ein bestehendes Projekt, um sich dann im Anschluss mit Hilfe eines</w:t>
+        </w:r>
+      </w:ins>
+      <w:ins w:id="60" w:author="Imke Endjer" w:date="2023-02-23T11:01:00Z">
+        <w:r>
+          <w:t xml:space="preserve"> Projekt-Canvas</w:t>
+        </w:r>
+      </w:ins>
+      <w:ins w:id="61" w:author="Imke Endjer" w:date="2023-02-23T11:12:00Z">
+        <w:r>
+          <w:t xml:space="preserve"> (KI-A2.2)</w:t>
+        </w:r>
+      </w:ins>
+      <w:ins w:id="62" w:author="Imke Endjer" w:date="2023-02-23T11:01:00Z">
+        <w:r>
+          <w:t xml:space="preserve"> selbst Gedanken </w:t>
+        </w:r>
+      </w:ins>
+      <w:ins w:id="63" w:author="Imke Endjer" w:date="2023-02-23T11:13:00Z">
+        <w:r>
+          <w:t>über ihren eigenen Ideen</w:t>
+        </w:r>
+      </w:ins>
+      <w:ins w:id="64" w:author="Imke Endjer" w:date="2023-02-23T11:12:00Z">
+        <w:r>
+          <w:t xml:space="preserve"> und Kriterien zu machen. Im Anschluss </w:t>
+        </w:r>
+      </w:ins>
+      <w:ins w:id="65" w:author="Imke Endjer" w:date="2023-02-23T11:13:00Z">
+        <w:r>
+          <w:t>setzen die Schülerinnen und Schüler ihr Modell mit Hilfe von Snap! um.</w:t>
+        </w:r>
+      </w:ins>
+    </w:p>
+    <w:p>
+      <w:pPr>
+        <w:pStyle w:val="berschrift2"/>
+        <w:rPr>
+          <w:ins w:id="66" w:author="Imke Endjer" w:date="2023-02-23T10:54:00Z"/>
+        </w:rPr>
+      </w:pPr>
+      <w:ins w:id="67" w:author="Imke Endjer" w:date="2023-02-23T10:53:00Z">
+        <w:r>
+          <w:t>Grober Unterrichtsplan</w:t>
+        </w:r>
+      </w:ins>
+    </w:p>
+    <w:tbl>
+      <w:tblPr>
+        <w:tblStyle w:val="Stundenverlaufsskizzen"/>
+        <w:tblW w:w="8901" w:type="dxa"/>
+        <w:tblLook w:val="04A0" w:firstRow="1" w:lastRow="0" w:firstColumn="1" w:lastColumn="0" w:noHBand="0" w:noVBand="1"/>
+      </w:tblPr>
+      <w:tblGrid>
+        <w:gridCol w:w="2665"/>
+        <w:gridCol w:w="6236"/>
+      </w:tblGrid>
+      <w:tr>
+        <w:trPr>
+          <w:cnfStyle w:val="100000000000" w:firstRow="1" w:lastRow="0" w:firstColumn="0" w:lastColumn="0" w:oddVBand="0" w:evenVBand="0" w:oddHBand="0" w:evenHBand="0" w:firstRowFirstColumn="0" w:firstRowLastColumn="0" w:lastRowFirstColumn="0" w:lastRowLastColumn="0"/>
+          <w:ins w:id="68" w:author="Imke Endjer" w:date="2023-02-23T10:54:00Z"/>
+        </w:trPr>
+        <w:tc>
+          <w:tcPr>
+            <w:cnfStyle w:val="001000000000" w:firstRow="0" w:lastRow="0" w:firstColumn="1" w:lastColumn="0" w:oddVBand="0" w:evenVBand="0" w:oddHBand="0" w:evenHBand="0" w:firstRowFirstColumn="0" w:firstRowLastColumn="0" w:lastRowFirstColumn="0" w:lastRowLastColumn="0"/>
+            <w:tcW w:w="2665" w:type="dxa"/>
+          </w:tcPr>
+          <w:p>
+            <w:pPr>
+              <w:rPr>
+                <w:ins w:id="69" w:author="Imke Endjer" w:date="2023-02-23T10:54:00Z"/>
+              </w:rPr>
+            </w:pPr>
+            <w:ins w:id="70" w:author="Imke Endjer" w:date="2023-02-23T10:54:00Z">
+              <w:r>
+                <w:t>Unterrichtsszenarien</w:t>
+              </w:r>
+            </w:ins>
+          </w:p>
+        </w:tc>
+        <w:tc>
+          <w:tcPr>
+            <w:tcW w:w="6236" w:type="dxa"/>
+          </w:tcPr>
+          <w:p>
+            <w:pPr>
+              <w:cnfStyle w:val="100000000000" w:firstRow="1" w:lastRow="0" w:firstColumn="0" w:lastColumn="0" w:oddVBand="0" w:evenVBand="0" w:oddHBand="0" w:evenHBand="0" w:firstRowFirstColumn="0" w:firstRowLastColumn="0" w:lastRowFirstColumn="0" w:lastRowLastColumn="0"/>
+              <w:rPr>
+                <w:ins w:id="71" w:author="Imke Endjer" w:date="2023-02-23T10:54:00Z"/>
+              </w:rPr>
+            </w:pPr>
+            <w:ins w:id="72" w:author="Imke Endjer" w:date="2023-02-23T10:54:00Z">
+              <w:r>
+                <w:t>Kurze Zusammenfassung</w:t>
+              </w:r>
+            </w:ins>
+          </w:p>
+        </w:tc>
+      </w:tr>
+      <w:tr>
+        <w:trPr>
+          <w:cnfStyle w:val="000000100000" w:firstRow="0" w:lastRow="0" w:firstColumn="0" w:lastColumn="0" w:oddVBand="0" w:evenVBand="0" w:oddHBand="1" w:evenHBand="0" w:firstRowFirstColumn="0" w:firstRowLastColumn="0" w:lastRowFirstColumn="0" w:lastRowLastColumn="0"/>
+          <w:ins w:id="73" w:author="Imke Endjer" w:date="2023-02-23T10:54:00Z"/>
+        </w:trPr>
+        <w:tc>
+          <w:tcPr>
+            <w:cnfStyle w:val="001000000000" w:firstRow="0" w:lastRow="0" w:firstColumn="1" w:lastColumn="0" w:oddVBand="0" w:evenVBand="0" w:oddHBand="0" w:evenHBand="0" w:firstRowFirstColumn="0" w:firstRowLastColumn="0" w:lastRowFirstColumn="0" w:lastRowLastColumn="0"/>
+            <w:tcW w:w="2665" w:type="dxa"/>
+          </w:tcPr>
+          <w:p>
+            <w:pPr>
+              <w:rPr>
+                <w:ins w:id="74" w:author="Imke Endjer" w:date="2023-02-23T10:54:00Z"/>
+              </w:rPr>
+            </w:pPr>
+            <w:ins w:id="75" w:author="Imke Endjer" w:date="2023-02-23T10:54:00Z">
+              <w:r>
+                <w:t>Einstieg</w:t>
+              </w:r>
+            </w:ins>
+          </w:p>
+        </w:tc>
+        <w:tc>
+          <w:tcPr>
+            <w:tcW w:w="6236" w:type="dxa"/>
+          </w:tcPr>
+          <w:p>
+            <w:pPr>
+              <w:jc w:val="both"/>
+              <w:cnfStyle w:val="000000100000" w:firstRow="0" w:lastRow="0" w:firstColumn="0" w:lastColumn="0" w:oddVBand="0" w:evenVBand="0" w:oddHBand="1" w:evenHBand="0" w:firstRowFirstColumn="0" w:firstRowLastColumn="0" w:lastRowFirstColumn="0" w:lastRowLastColumn="0"/>
+              <w:rPr>
+                <w:ins w:id="76" w:author="Imke Endjer" w:date="2023-02-23T10:54:00Z"/>
+              </w:rPr>
+            </w:pPr>
+            <w:ins w:id="77" w:author="Imke Endjer" w:date="2023-02-23T11:01:00Z">
+              <w:r>
+                <w:t xml:space="preserve">Der Einstieg kann bspw. über </w:t>
+              </w:r>
+            </w:ins>
+            <w:ins w:id="78" w:author="Imke Endjer" w:date="2023-02-23T11:02:00Z">
+              <w:r>
+                <w:t xml:space="preserve">einen Impuls erfolgen oder über die Concept-Cartoons aus Modul KI-B1 </w:t>
+              </w:r>
+            </w:ins>
+            <w:ins w:id="79" w:author="Imke Endjer" w:date="2023-02-23T11:09:00Z">
+              <w:r>
+                <w:t>zu Sprachassistenten</w:t>
+              </w:r>
+            </w:ins>
+          </w:p>
+        </w:tc>
+      </w:tr>
+      <w:tr>
+        <w:trPr>
+          <w:ins w:id="80" w:author="Imke Endjer" w:date="2023-02-23T10:54:00Z"/>
+        </w:trPr>
+        <w:tc>
+          <w:tcPr>
+            <w:cnfStyle w:val="001000000000" w:firstRow="0" w:lastRow="0" w:firstColumn="1" w:lastColumn="0" w:oddVBand="0" w:evenVBand="0" w:oddHBand="0" w:evenHBand="0" w:firstRowFirstColumn="0" w:firstRowLastColumn="0" w:lastRowFirstColumn="0" w:lastRowLastColumn="0"/>
+            <w:tcW w:w="2665" w:type="dxa"/>
+          </w:tcPr>
+          <w:p>
+            <w:pPr>
+              <w:rPr>
+                <w:ins w:id="81" w:author="Imke Endjer" w:date="2023-02-23T10:54:00Z"/>
+              </w:rPr>
+            </w:pPr>
+            <w:ins w:id="82" w:author="Imke Endjer" w:date="2023-02-23T11:04:00Z">
+              <w:r>
+                <w:t>Use</w:t>
+              </w:r>
+            </w:ins>
+          </w:p>
+        </w:tc>
+        <w:tc>
+          <w:tcPr>
+            <w:tcW w:w="6236" w:type="dxa"/>
+          </w:tcPr>
+          <w:p>
+            <w:pPr>
+              <w:jc w:val="both"/>
+              <w:cnfStyle w:val="000000000000" w:firstRow="0" w:lastRow="0" w:firstColumn="0" w:lastColumn="0" w:oddVBand="0" w:evenVBand="0" w:oddHBand="0" w:evenHBand="0" w:firstRowFirstColumn="0" w:firstRowLastColumn="0" w:lastRowFirstColumn="0" w:lastRowLastColumn="0"/>
+              <w:rPr>
+                <w:ins w:id="83" w:author="Imke Endjer" w:date="2023-02-23T10:54:00Z"/>
+              </w:rPr>
+            </w:pPr>
+            <w:ins w:id="84" w:author="Imke Endjer" w:date="2023-02-23T10:56:00Z">
+              <w:r>
+                <w:t>Auseinandersetzen</w:t>
+              </w:r>
+            </w:ins>
+            <w:ins w:id="85" w:author="Imke Endjer" w:date="2023-02-23T10:57:00Z">
+              <w:r>
+                <w:t xml:space="preserve"> </w:t>
+              </w:r>
+            </w:ins>
+            <w:ins w:id="86" w:author="Imke Endjer" w:date="2023-02-23T11:22:00Z">
+              <w:r>
+                <w:t xml:space="preserve">mit </w:t>
+              </w:r>
+            </w:ins>
+            <w:ins w:id="87" w:author="Imke Endjer" w:date="2023-02-23T11:21:00Z">
+              <w:r>
+                <w:t>eine</w:t>
+              </w:r>
+            </w:ins>
+            <w:ins w:id="88" w:author="Imke Endjer" w:date="2023-02-23T11:22:00Z">
+              <w:r>
+                <w:t>m</w:t>
+              </w:r>
+            </w:ins>
+            <w:ins w:id="89" w:author="Imke Endjer" w:date="2023-02-23T10:56:00Z">
+              <w:r>
+                <w:t xml:space="preserve"> </w:t>
+              </w:r>
+            </w:ins>
+            <w:ins w:id="90" w:author="Imke Endjer" w:date="2023-02-23T10:57:00Z">
+              <w:r>
+                <w:t xml:space="preserve">bestehenden </w:t>
+              </w:r>
+            </w:ins>
+            <w:ins w:id="91" w:author="Imke Endjer" w:date="2023-02-23T11:09:00Z">
+              <w:r>
+                <w:t>persönl</w:t>
+              </w:r>
+            </w:ins>
+            <w:ins w:id="92" w:author="Imke Endjer" w:date="2023-02-23T11:10:00Z">
+              <w:r>
+                <w:t xml:space="preserve">ichen digitalen Assistenten </w:t>
+              </w:r>
+            </w:ins>
+            <w:ins w:id="93" w:author="Imke Endjer" w:date="2023-02-23T11:22:00Z">
+              <w:r>
+                <w:t xml:space="preserve"> und Ausprobieren verschiedener Funktionen (KI-A2.2 Seite 1-4)</w:t>
+              </w:r>
+            </w:ins>
+          </w:p>
+        </w:tc>
+      </w:tr>
+      <w:tr>
+        <w:trPr>
+          <w:cnfStyle w:val="000000100000" w:firstRow="0" w:lastRow="0" w:firstColumn="0" w:lastColumn="0" w:oddVBand="0" w:evenVBand="0" w:oddHBand="1" w:evenHBand="0" w:firstRowFirstColumn="0" w:firstRowLastColumn="0" w:lastRowFirstColumn="0" w:lastRowLastColumn="0"/>
+          <w:ins w:id="94" w:author="Imke Endjer" w:date="2023-02-23T10:54:00Z"/>
+        </w:trPr>
+        <w:tc>
+          <w:tcPr>
+            <w:cnfStyle w:val="001000000000" w:firstRow="0" w:lastRow="0" w:firstColumn="1" w:lastColumn="0" w:oddVBand="0" w:evenVBand="0" w:oddHBand="0" w:evenHBand="0" w:firstRowFirstColumn="0" w:firstRowLastColumn="0" w:lastRowFirstColumn="0" w:lastRowLastColumn="0"/>
+            <w:tcW w:w="2665" w:type="dxa"/>
+          </w:tcPr>
+          <w:p>
+            <w:pPr>
+              <w:rPr>
+                <w:ins w:id="95" w:author="Imke Endjer" w:date="2023-02-23T10:54:00Z"/>
+              </w:rPr>
+            </w:pPr>
+            <w:ins w:id="96" w:author="Imke Endjer" w:date="2023-02-23T11:04:00Z">
+              <w:r>
+                <w:t>Modify</w:t>
+              </w:r>
+            </w:ins>
+          </w:p>
+        </w:tc>
+        <w:tc>
+          <w:tcPr>
+            <w:tcW w:w="6236" w:type="dxa"/>
+          </w:tcPr>
+          <w:p>
+            <w:pPr>
+              <w:jc w:val="both"/>
+              <w:cnfStyle w:val="000000100000" w:firstRow="0" w:lastRow="0" w:firstColumn="0" w:lastColumn="0" w:oddVBand="0" w:evenVBand="0" w:oddHBand="1" w:evenHBand="0" w:firstRowFirstColumn="0" w:firstRowLastColumn="0" w:lastRowFirstColumn="0" w:lastRowLastColumn="0"/>
+              <w:rPr>
+                <w:ins w:id="97" w:author="Imke Endjer" w:date="2023-02-23T10:54:00Z"/>
+              </w:rPr>
+            </w:pPr>
+            <w:ins w:id="98" w:author="Imke Endjer" w:date="2023-02-23T11:02:00Z">
+              <w:r>
+                <w:t xml:space="preserve">Die Schülerinnen und Schüler </w:t>
+              </w:r>
+            </w:ins>
+            <w:ins w:id="99" w:author="Imke Endjer" w:date="2023-02-23T11:03:00Z">
+              <w:r>
+                <w:t xml:space="preserve">entwickeln verschiedene Kriterien, die ihr </w:t>
+              </w:r>
+            </w:ins>
+            <w:ins w:id="100" w:author="Imke Endjer" w:date="2023-02-23T11:10:00Z">
+              <w:r>
+                <w:t>persönlicher Assistent</w:t>
+              </w:r>
+            </w:ins>
+            <w:ins w:id="101" w:author="Imke Endjer" w:date="2023-02-23T11:03:00Z">
+              <w:r>
+                <w:t xml:space="preserve"> erfüllen soll. Dabei nutzten sie das Arbeitsmaterial KI-A2.2</w:t>
+              </w:r>
+            </w:ins>
+          </w:p>
+        </w:tc>
+      </w:tr>
+      <w:tr>
+        <w:trPr>
+          <w:ins w:id="102" w:author="Imke Endjer" w:date="2023-02-23T10:54:00Z"/>
+        </w:trPr>
+        <w:tc>
+          <w:tcPr>
+            <w:cnfStyle w:val="001000000000" w:firstRow="0" w:lastRow="0" w:firstColumn="1" w:lastColumn="0" w:oddVBand="0" w:evenVBand="0" w:oddHBand="0" w:evenHBand="0" w:firstRowFirstColumn="0" w:firstRowLastColumn="0" w:lastRowFirstColumn="0" w:lastRowLastColumn="0"/>
+            <w:tcW w:w="2665" w:type="dxa"/>
+          </w:tcPr>
+          <w:p>
+            <w:pPr>
+              <w:rPr>
+                <w:ins w:id="103" w:author="Imke Endjer" w:date="2023-02-23T10:54:00Z"/>
+              </w:rPr>
+            </w:pPr>
+            <w:ins w:id="104" w:author="Imke Endjer" w:date="2023-02-23T11:04:00Z">
+              <w:r>
+                <w:t>Create</w:t>
+              </w:r>
+            </w:ins>
+          </w:p>
+        </w:tc>
+        <w:tc>
+          <w:tcPr>
+            <w:tcW w:w="6236" w:type="dxa"/>
+          </w:tcPr>
+          <w:p>
+            <w:pPr>
+              <w:jc w:val="both"/>
+              <w:cnfStyle w:val="000000000000" w:firstRow="0" w:lastRow="0" w:firstColumn="0" w:lastColumn="0" w:oddVBand="0" w:evenVBand="0" w:oddHBand="0" w:evenHBand="0" w:firstRowFirstColumn="0" w:firstRowLastColumn="0" w:lastRowFirstColumn="0" w:lastRowLastColumn="0"/>
+              <w:rPr>
+                <w:ins w:id="105" w:author="Imke Endjer" w:date="2023-02-23T10:54:00Z"/>
+              </w:rPr>
+            </w:pPr>
+            <w:ins w:id="106" w:author="Imke Endjer" w:date="2023-02-23T11:05:00Z">
+              <w:r>
+                <w:t xml:space="preserve">Die Schülerinnen und Schüler </w:t>
+              </w:r>
+            </w:ins>
+            <w:ins w:id="107" w:author="Imke Endjer" w:date="2023-02-23T11:10:00Z">
+              <w:r>
+                <w:t xml:space="preserve">setzten </w:t>
+              </w:r>
+            </w:ins>
+            <w:ins w:id="108" w:author="Imke Endjer" w:date="2023-02-23T11:21:00Z">
+              <w:r>
+                <w:t>entwickelten</w:t>
+              </w:r>
+            </w:ins>
+            <w:ins w:id="109" w:author="Imke Endjer" w:date="2023-02-23T11:10:00Z">
+              <w:r>
+                <w:t xml:space="preserve"> für</w:t>
+              </w:r>
+            </w:ins>
+            <w:ins w:id="110" w:author="Imke Endjer" w:date="2023-02-23T11:05:00Z">
+              <w:r>
+                <w:t xml:space="preserve"> ihren eigenen </w:t>
+              </w:r>
+            </w:ins>
+            <w:ins w:id="111" w:author="Imke Endjer" w:date="2023-02-23T11:11:00Z">
+              <w:r>
+                <w:t>persönlichen digitalen Assistenten</w:t>
+              </w:r>
+            </w:ins>
+            <w:ins w:id="112" w:author="Imke Endjer" w:date="2023-02-23T11:05:00Z">
+              <w:r>
+                <w:t xml:space="preserve"> mit Hilfe von Snap!</w:t>
+              </w:r>
+            </w:ins>
+            <w:ins w:id="113" w:author="Imke Endjer" w:date="2023-02-23T11:11:00Z">
+              <w:r>
+                <w:t xml:space="preserve"> </w:t>
+              </w:r>
+            </w:ins>
+            <w:ins w:id="114" w:author="Imke Endjer" w:date="2023-02-23T11:21:00Z">
+              <w:r>
+                <w:t>auf Grundlage des bestehenden persönlichen Assistenten um.</w:t>
+              </w:r>
+            </w:ins>
+          </w:p>
+        </w:tc>
+      </w:tr>
+      <w:tr>
+        <w:trPr>
+          <w:cnfStyle w:val="000000100000" w:firstRow="0" w:lastRow="0" w:firstColumn="0" w:lastColumn="0" w:oddVBand="0" w:evenVBand="0" w:oddHBand="1" w:evenHBand="0" w:firstRowFirstColumn="0" w:firstRowLastColumn="0" w:lastRowFirstColumn="0" w:lastRowLastColumn="0"/>
+          <w:ins w:id="115" w:author="Imke Endjer" w:date="2023-02-23T11:05:00Z"/>
+        </w:trPr>
+        <w:tc>
+          <w:tcPr>
+            <w:cnfStyle w:val="001000000000" w:firstRow="0" w:lastRow="0" w:firstColumn="1" w:lastColumn="0" w:oddVBand="0" w:evenVBand="0" w:oddHBand="0" w:evenHBand="0" w:firstRowFirstColumn="0" w:firstRowLastColumn="0" w:lastRowFirstColumn="0" w:lastRowLastColumn="0"/>
+            <w:tcW w:w="2665" w:type="dxa"/>
+          </w:tcPr>
+          <w:p>
+            <w:pPr>
+              <w:rPr>
+                <w:ins w:id="116" w:author="Imke Endjer" w:date="2023-02-23T11:05:00Z"/>
+              </w:rPr>
+            </w:pPr>
+            <w:ins w:id="117" w:author="Imke Endjer" w:date="2023-02-23T11:06:00Z">
+              <w:r>
+                <w:t>Abschluss</w:t>
+              </w:r>
+            </w:ins>
+          </w:p>
+        </w:tc>
+        <w:tc>
+          <w:tcPr>
+            <w:tcW w:w="6236" w:type="dxa"/>
+          </w:tcPr>
+          <w:p>
+            <w:pPr>
+              <w:jc w:val="both"/>
+              <w:cnfStyle w:val="000000100000" w:firstRow="0" w:lastRow="0" w:firstColumn="0" w:lastColumn="0" w:oddVBand="0" w:evenVBand="0" w:oddHBand="1" w:evenHBand="0" w:firstRowFirstColumn="0" w:firstRowLastColumn="0" w:lastRowFirstColumn="0" w:lastRowLastColumn="0"/>
+              <w:rPr>
+                <w:ins w:id="118" w:author="Imke Endjer" w:date="2023-02-23T11:05:00Z"/>
+              </w:rPr>
+            </w:pPr>
+            <w:ins w:id="119" w:author="Imke Endjer" w:date="2023-02-23T11:06:00Z">
+              <w:r>
+                <w:t xml:space="preserve">Die Schülerinnen und Schüler stellen ihre </w:t>
+              </w:r>
+            </w:ins>
+            <w:ins w:id="120" w:author="Imke Endjer" w:date="2023-02-23T11:11:00Z">
+              <w:r>
+                <w:t>Assistenten</w:t>
+              </w:r>
+            </w:ins>
+            <w:ins w:id="121" w:author="Imke Endjer" w:date="2023-02-23T11:06:00Z">
+              <w:r>
+                <w:t xml:space="preserve"> vor bspw. anhand eines Gallery </w:t>
+              </w:r>
+              <w:proofErr w:type="spellStart"/>
+              <w:r>
+                <w:t>Walks</w:t>
+              </w:r>
+            </w:ins>
+            <w:proofErr w:type="spellEnd"/>
+            <w:ins w:id="122" w:author="Imke Endjer" w:date="2023-02-23T11:11:00Z">
+              <w:r>
+                <w:t xml:space="preserve"> vor</w:t>
+              </w:r>
+            </w:ins>
+          </w:p>
+        </w:tc>
+      </w:tr>
+    </w:tbl>
+    <w:p>
+      <w:pPr>
+        <w:jc w:val="both"/>
+        <w:rPr>
+          <w:del w:id="123" w:author="Imke Endjer" w:date="2023-02-23T10:54:00Z"/>
+        </w:rPr>
+      </w:pPr>
+    </w:p>
+    <w:p>
+      <w:pPr>
+        <w:rPr>
+          <w:ins w:id="124" w:author="Imke Endjer" w:date="2023-02-23T11:08:00Z"/>
+        </w:rPr>
+        <w:pPrChange w:id="125" w:author="Imke Endjer" w:date="2023-02-23T10:54:00Z">
+          <w:pPr>
+            <w:pStyle w:val="berschrift1"/>
+            <w:numPr>
+              <w:numId w:val="3"/>
+            </w:numPr>
+            <w:tabs>
+              <w:tab w:val="clear" w:pos="720"/>
+            </w:tabs>
+            <w:ind w:left="432" w:hanging="432"/>
+          </w:pPr>
+        </w:pPrChange>
+      </w:pPr>
     </w:p>
     <w:p>
       <w:pPr>
         <w:jc w:val="both"/>
       </w:pPr>
       <w:r>
-        <w:t xml:space="preserve">Zu Beginn der Unterrichtseinheit wird das Vorhaben vorgestellt: Ziel der Einheit ist es, einen persönlichen digitalen Assistenten in Snap! </w:t>
+        <w:t xml:space="preserve">Zu Beginn der Unterrichtseinheit wird das Vorhaben vorgestellt: Ziel der Einheit ist es, einen persönlichen digitalen Assistenten in Snap! zu erstellen. Danach kann der Assistent mit Karton, Pappe und weiteren Bastelmaterialien zum Leben erweckt werden. Im Anschluss daran können sich die Schülerinnen und Schüler in Kleingruppen aufteilen. Für jede Gruppe sollte ein Großteil der </w:t>
       </w:r>
       <w:r>
-        <w:t>z</w:t>
-      </w:r>
-      <w:r>
-        <w:t>u erstellen. Danach kann der Assistent mit Karton, Pappe und weiteren Bastelmaterialien zum Leben erweckt werden. Im</w:t>
-      </w:r>
-      <w:r>
-        <w:t xml:space="preserve"> Anschluss daran können sich die Schülerinnen und Schüler in Kleingruppen aufteilen. Für jede Gruppe sollte ein Großteil der benötigten Materialien (vgl. KI-A2.4) bereit stehen. Die Schülerinnen und Schüler können auch ihre eigenen Materialien mitbringen. </w:t>
+        <w:lastRenderedPageBreak/>
+        <w:t xml:space="preserve">benötigten Materialien (vgl. KI-A2.4) bereit stehen. Die Schülerinnen und Schüler können auch ihre eigenen Materialien mitbringen. </w:t>
       </w:r>
     </w:p>
     <w:p>
@@ -3568,10 +4305,7 @@
         <w:jc w:val="both"/>
       </w:pPr>
       <w:r>
-        <w:t xml:space="preserve">Die unterrichtliche Umsetzung folgt dem Use-Modify-Create-Konzept. Dabei wird zunächst ein bestehendes Projekt (KI-A2.1) ausprobiert, bei dem man lernt das Handy mit der Snap!-Instanz zu verbinden und wie sich der eigene Assistent aus Snap heraus steuern </w:t>
-      </w:r>
-      <w:r>
-        <w:t>lässt. In seiner Grundform erlaubt das Projekt, die Mimik des Assistenten basierend auf den Grüßen des Nutzers anzupassen. Im Modify-Schritt wird das Projekt verbessert, sodass weitere Sätze erkannt werden.</w:t>
+        <w:t>Die unterrichtliche Umsetzung folgt dem Use-Modify-Create-Konzept. Dabei wird zunächst ein bestehendes Projekt (KI-A2.1) ausprobiert, bei dem man lernt das Handy mit der Snap!-Instanz zu verbinden und wie sich der eigene Assistent aus Snap heraus steuern lässt. In seiner Grundform erlaubt das Projekt, die Mimik des Assistenten basierend auf den Grüßen des Nutzers anzupassen. Im Modify-Schritt wird das Projekt verbessert, sodass weitere Sätze erkannt werden.</w:t>
       </w:r>
     </w:p>
     <w:p>
@@ -3579,10 +4313,7 @@
         <w:jc w:val="both"/>
       </w:pPr>
       <w:r>
-        <w:t>Anschließend sollen sich die Schülerinnen und Sch</w:t>
-      </w:r>
-      <w:r>
-        <w:t>üler Gedanken über ihr eigenes Projekt machen. Dazu füllen sie das Projekt-Canvas aus (KI-A2.2), dass die Entwicklung leiten soll. Auch Inspiration durch bereits absolvierte KI-Module sind denkbar. Mögliche Ideen für Projekte sind:</w:t>
+        <w:t>Anschließend sollen sich die Schülerinnen und Schüler Gedanken über ihr eigenes Projekt machen. Dazu füllen sie das Projekt-Canvas aus (KI-A2.2), dass die Entwicklung leiten soll. Auch Inspiration durch bereits absolvierte KI-Module sind denkbar. Mögliche Ideen für Projekte sind:</w:t>
       </w:r>
     </w:p>
     <w:p>
@@ -3595,16 +4326,7 @@
         <w:jc w:val="both"/>
       </w:pPr>
       <w:r>
-        <w:t xml:space="preserve">Ein Assistent, der sich </w:t>
-      </w:r>
-      <w:r>
-        <w:t xml:space="preserve">um Senioren kümmert und sich mit </w:t>
-      </w:r>
-      <w:r>
-        <w:t>i</w:t>
-      </w:r>
-      <w:r>
-        <w:t>hnen unterhält</w:t>
+        <w:t>Ein Assistent, der sich um Senioren kümmert und sich mit ihnen unterhält</w:t>
       </w:r>
     </w:p>
     <w:p>
@@ -3617,10 +4339,7 @@
         <w:jc w:val="both"/>
       </w:pPr>
       <w:r>
-        <w:t xml:space="preserve">Ein Assistent, </w:t>
-      </w:r>
-      <w:r>
-        <w:t>der Krankheiten anhand der Symptome erkennt und Behandlungshinweise gibt</w:t>
+        <w:t>Ein Assistent, der Krankheiten anhand der Symptome erkennt und Behandlungshinweise gibt</w:t>
       </w:r>
     </w:p>
     <w:p>
@@ -3645,10 +4364,7 @@
         <w:jc w:val="both"/>
       </w:pPr>
       <w:r>
-        <w:t>Ein Assistent fürs Kochen, der jeweils den nächsten Sc</w:t>
-      </w:r>
-      <w:r>
-        <w:t>hritt eines Rezepts sagt und auf Kommando den nächsten Schritt vorliest</w:t>
+        <w:t>Ein Assistent fürs Kochen, der jeweils den nächsten Schritt eines Rezepts sagt und auf Kommando den nächsten Schritt vorliest</w:t>
       </w:r>
     </w:p>
     <w:p>
@@ -3656,39 +4372,18 @@
         <w:jc w:val="both"/>
       </w:pPr>
       <w:r>
-        <w:t xml:space="preserve">Nach Wahl des Projekts beginnt die Projektarbeitsphase. Die einzelnen Gruppen </w:t>
-      </w:r>
-      <w:r>
-        <w:t>planen</w:t>
-      </w:r>
-      <w:r>
-        <w:t xml:space="preserve"> ihren eigenen Assistenten zunächst </w:t>
-      </w:r>
-      <w:r>
-        <w:t>mit Hilfe eines “Canvas”</w:t>
-      </w:r>
-      <w:r>
-        <w:t>, um festzulegen was der digitale Assist</w:t>
-      </w:r>
-      <w:r>
-        <w:t xml:space="preserve">ent können soll. Dann implementieren sie </w:t>
-      </w:r>
-      <w:r>
-        <w:t>diese Funktionalität in Snap!</w:t>
-      </w:r>
-      <w:r>
-        <w:t xml:space="preserve">. Anschließend bauen die Schülerinnen und Schüler eine Verpackung mit den Bastelmaterialien und verzieren sie, um den digitalen Assistenten zum Leben zu erwecken. </w:t>
+        <w:t xml:space="preserve">Nach Wahl des Projekts beginnt die Projektarbeitsphase. Die einzelnen Gruppen planen ihren eigenen Assistenten zunächst mit Hilfe eines “Canvas”, um festzulegen was der digitale Assistent können soll. Dann implementieren sie diese Funktionalität in Snap!. Anschließend bauen die Schülerinnen und Schüler eine Verpackung mit den Bastelmaterialien und verzieren sie, um den digitalen Assistenten zum Leben zu erwecken. </w:t>
       </w:r>
     </w:p>
     <w:p>
       <w:pPr>
         <w:jc w:val="both"/>
+        <w:rPr>
+          <w:ins w:id="126" w:author="Imke Endjer" w:date="2023-02-23T11:19:00Z"/>
+        </w:rPr>
       </w:pPr>
       <w:r>
-        <w:t>Nach Beendigung der Pr</w:t>
-      </w:r>
-      <w:r>
-        <w:t xml:space="preserve">ojektphase stellen schließlich alle Gruppen ihre Ergebnisse – das </w:t>
+        <w:t xml:space="preserve">Nach Beendigung der Projektphase stellen schließlich alle Gruppen ihre Ergebnisse – das </w:t>
       </w:r>
       <w:proofErr w:type="spellStart"/>
       <w:r>
@@ -3696,11 +4391,13 @@
       </w:r>
       <w:proofErr w:type="spellEnd"/>
       <w:r>
-        <w:t xml:space="preserve"> und das eigentliche Produkt – gegenseitig vor. Dafür eignet sich die Methode „Gallery Walk“, bei der das Klassenzimmer zur Galerie wird und die Ergebnisse der einzelnen Gruppen</w:t>
+        <w:t xml:space="preserve"> und das eigentliche Produkt – gegenseitig vor. Dafür eignet sich die Methode „Gallery Walk“, bei der das Klassenzimmer zur Galerie wird und die Ergebnisse der einzelnen Gruppen als Ausstellungsstücke im Raum verteilt werden.</w:t>
       </w:r>
-      <w:r>
-        <w:t xml:space="preserve"> als Ausstellungsstücke im Raum verteilt werden.</w:t>
-      </w:r>
+    </w:p>
+    <w:p>
+      <w:pPr>
+        <w:jc w:val="both"/>
+      </w:pPr>
     </w:p>
     <w:p>
       <w:pPr>
@@ -3710,20 +4407,17 @@
           <w:numId w:val="3"/>
         </w:numPr>
       </w:pPr>
-      <w:bookmarkStart w:id="9" w:name="_Toc103785175"/>
+      <w:bookmarkStart w:id="127" w:name="_Toc103785175"/>
       <w:r>
         <w:t>Einbettung in verschiedene Fächer und Themen</w:t>
       </w:r>
-      <w:bookmarkEnd w:id="9"/>
+      <w:bookmarkEnd w:id="127"/>
     </w:p>
     <w:p>
-      <w:bookmarkStart w:id="10" w:name="_heading=h.4d34og8" w:colFirst="0" w:colLast="0"/>
-      <w:bookmarkEnd w:id="10"/>
+      <w:bookmarkStart w:id="128" w:name="_heading=h.4d34og8" w:colFirst="0" w:colLast="0"/>
+      <w:bookmarkEnd w:id="128"/>
       <w:r>
-        <w:t>Durch den Fokus auf kreatives Gestalten kann dieses Modul in einer Vielzahl von Fächern und Kontexten eingesetzt werden, beispielsweise im Kunstunterricht oder im</w:t>
-      </w:r>
-      <w:r>
-        <w:t xml:space="preserve"> Rahmen von Aktions- bzw. Projekttagen.</w:t>
+        <w:t>Durch den Fokus auf kreatives Gestalten kann dieses Modul in einer Vielzahl von Fächern und Kontexten eingesetzt werden, beispielsweise im Kunstunterricht oder im Rahmen von Aktions- bzw. Projekttagen.</w:t>
       </w:r>
     </w:p>
     <w:p/>
@@ -3738,14 +4432,14 @@
           <w:szCs w:val="28"/>
         </w:rPr>
       </w:pPr>
-      <w:bookmarkStart w:id="11" w:name="_Toc103785176"/>
+      <w:bookmarkStart w:id="129" w:name="_Toc103785176"/>
       <w:r>
         <w:rPr>
           <w:szCs w:val="28"/>
         </w:rPr>
         <w:t>Anschlussthemen</w:t>
       </w:r>
-      <w:bookmarkEnd w:id="11"/>
+      <w:bookmarkEnd w:id="129"/>
     </w:p>
     <w:p>
       <w:r>
@@ -3790,18 +4484,16 @@
           </w:tcPr>
           <w:p>
             <w:pPr>
-              <w:spacing w:line="240" w:lineRule="auto"/>
               <w:jc w:val="center"/>
               <w:rPr>
                 <w:rFonts w:ascii="Arial" w:eastAsia="Arial" w:hAnsi="Arial" w:cs="Arial"/>
-                <w:sz w:val="20"/>
               </w:rPr>
             </w:pPr>
             <w:r>
               <w:rPr>
                 <w:noProof/>
-                <w:sz w:val="20"/>
-              </w:rPr>
+              </w:rPr>
+              <w:lastRenderedPageBreak/>
               <w:drawing>
                 <wp:inline distT="0" distB="0" distL="0" distR="0" wp14:anchorId="3DD2AF2C" wp14:editId="5696F589">
                   <wp:extent cx="1226212" cy="864330"/>
@@ -3847,7 +4539,6 @@
           </w:tcPr>
           <w:p>
             <w:pPr>
-              <w:spacing w:line="240" w:lineRule="auto"/>
               <w:jc w:val="center"/>
               <w:rPr>
                 <w:rFonts w:ascii="Arial" w:eastAsia="Arial" w:hAnsi="Arial" w:cs="Arial"/>
@@ -3906,17 +4597,14 @@
           </w:tcPr>
           <w:p>
             <w:pPr>
-              <w:spacing w:line="240" w:lineRule="auto"/>
               <w:jc w:val="center"/>
               <w:rPr>
                 <w:rFonts w:ascii="Arial" w:eastAsia="Arial" w:hAnsi="Arial" w:cs="Arial"/>
-                <w:sz w:val="20"/>
               </w:rPr>
             </w:pPr>
             <w:r>
               <w:rPr>
                 <w:noProof/>
-                <w:sz w:val="20"/>
               </w:rPr>
               <w:drawing>
                 <wp:inline distT="0" distB="0" distL="0" distR="0" wp14:anchorId="3FFE426F" wp14:editId="1847648F">
@@ -4019,10 +4707,7 @@
     </w:p>
     <w:p>
       <w:r>
-        <w:t>Und schließlich bietet es sich im Anschluss an dieses Modul auch an, den zugrundeliegenden KI-Prinzipien in den Modulen KI-B1 “Find</w:t>
-      </w:r>
-      <w:r>
-        <w:t xml:space="preserve">e die KI” oder KI-B3 “Schlag den Roboter” auf den Grund zu gehen. Besonders geeignet ist die Thematisierung des Turing-Tests in KI-B2 „Im Dialog mit KI”. </w:t>
+        <w:t xml:space="preserve">Und schließlich bietet es sich im Anschluss an dieses Modul auch an, den zugrundeliegenden KI-Prinzipien in den Modulen KI-B1 “Finde die KI” oder KI-B3 “Schlag den Roboter” auf den Grund zu gehen. Besonders geeignet ist die Thematisierung des Turing-Tests in KI-B2 „Im Dialog mit KI”. </w:t>
       </w:r>
     </w:p>
     <w:tbl>
@@ -4058,17 +4743,14 @@
           </w:tcPr>
           <w:p>
             <w:pPr>
-              <w:spacing w:line="240" w:lineRule="auto"/>
               <w:jc w:val="center"/>
               <w:rPr>
                 <w:rFonts w:ascii="Arial" w:eastAsia="Arial" w:hAnsi="Arial" w:cs="Arial"/>
-                <w:sz w:val="20"/>
               </w:rPr>
             </w:pPr>
             <w:r>
               <w:rPr>
                 <w:noProof/>
-                <w:sz w:val="20"/>
               </w:rPr>
               <w:drawing>
                 <wp:inline distT="0" distB="0" distL="0" distR="0" wp14:anchorId="7973BAC4" wp14:editId="67D0F945">
@@ -4115,11 +4797,9 @@
           </w:tcPr>
           <w:p>
             <w:pPr>
-              <w:spacing w:line="240" w:lineRule="auto"/>
               <w:jc w:val="center"/>
               <w:rPr>
                 <w:rFonts w:ascii="Arial" w:eastAsia="Arial" w:hAnsi="Arial" w:cs="Arial"/>
-                <w:sz w:val="20"/>
               </w:rPr>
             </w:pPr>
             <w:r>
@@ -4173,17 +4853,14 @@
           </w:tcPr>
           <w:p>
             <w:pPr>
-              <w:spacing w:line="240" w:lineRule="auto"/>
               <w:jc w:val="center"/>
               <w:rPr>
                 <w:rFonts w:ascii="Arial" w:eastAsia="Arial" w:hAnsi="Arial" w:cs="Arial"/>
-                <w:sz w:val="20"/>
               </w:rPr>
             </w:pPr>
             <w:r>
               <w:rPr>
                 <w:noProof/>
-                <w:sz w:val="20"/>
               </w:rPr>
               <w:drawing>
                 <wp:inline distT="0" distB="0" distL="0" distR="0" wp14:anchorId="4CE017EC" wp14:editId="4C02926C">
@@ -4226,16 +4903,23 @@
       </w:tr>
     </w:tbl>
     <w:p>
-      <w:bookmarkStart w:id="12" w:name="_heading=h.17dp8vu" w:colFirst="0" w:colLast="0"/>
-      <w:bookmarkEnd w:id="12"/>
+      <w:pPr>
+        <w:rPr>
+          <w:del w:id="130" w:author="Imke Endjer" w:date="2023-02-23T11:14:00Z"/>
+        </w:rPr>
+      </w:pPr>
+      <w:bookmarkStart w:id="131" w:name="_heading=h.17dp8vu" w:colFirst="0" w:colLast="0"/>
+      <w:bookmarkEnd w:id="131"/>
     </w:p>
     <w:p>
       <w:pPr>
         <w:spacing w:line="259" w:lineRule="auto"/>
       </w:pPr>
-      <w:r>
-        <w:br w:type="page"/>
-      </w:r>
+      <w:del w:id="132" w:author="Imke Endjer" w:date="2023-02-23T11:14:00Z">
+        <w:r>
+          <w:br w:type="page"/>
+        </w:r>
+      </w:del>
     </w:p>
     <w:p>
       <w:pPr>
@@ -4244,12 +4928,25 @@
           <w:ilvl w:val="0"/>
           <w:numId w:val="3"/>
         </w:numPr>
+        <w:spacing w:before="200"/>
+        <w:pPrChange w:id="133" w:author="Imke Endjer" w:date="2023-02-23T11:15:00Z">
+          <w:pPr>
+            <w:pStyle w:val="berschrift1"/>
+            <w:numPr>
+              <w:numId w:val="3"/>
+            </w:numPr>
+            <w:tabs>
+              <w:tab w:val="clear" w:pos="720"/>
+            </w:tabs>
+            <w:ind w:left="432" w:hanging="432"/>
+          </w:pPr>
+        </w:pPrChange>
       </w:pPr>
-      <w:bookmarkStart w:id="13" w:name="_Toc103785177"/>
+      <w:bookmarkStart w:id="134" w:name="_Toc103785177"/>
       <w:r>
         <w:t>Arbeitsmaterialien</w:t>
       </w:r>
-      <w:bookmarkEnd w:id="13"/>
+      <w:bookmarkEnd w:id="134"/>
     </w:p>
     <w:tbl>
       <w:tblPr>
@@ -4283,16 +4980,13 @@
           </w:tcPr>
           <w:p>
             <w:pPr>
-              <w:spacing w:line="240" w:lineRule="auto"/>
               <w:rPr>
                 <w:rFonts w:ascii="Arial" w:eastAsia="Arial" w:hAnsi="Arial" w:cs="Arial"/>
-                <w:sz w:val="20"/>
               </w:rPr>
             </w:pPr>
             <w:r>
               <w:rPr>
                 <w:rFonts w:ascii="Arial" w:eastAsia="Arial" w:hAnsi="Arial" w:cs="Arial"/>
-                <w:sz w:val="20"/>
               </w:rPr>
               <w:t>Nr.</w:t>
             </w:r>
@@ -4304,17 +4998,14 @@
           </w:tcPr>
           <w:p>
             <w:pPr>
-              <w:spacing w:line="240" w:lineRule="auto"/>
               <w:cnfStyle w:val="100000000000" w:firstRow="1" w:lastRow="0" w:firstColumn="0" w:lastColumn="0" w:oddVBand="0" w:evenVBand="0" w:oddHBand="0" w:evenHBand="0" w:firstRowFirstColumn="0" w:firstRowLastColumn="0" w:lastRowFirstColumn="0" w:lastRowLastColumn="0"/>
               <w:rPr>
                 <w:rFonts w:ascii="Arial" w:eastAsia="Arial" w:hAnsi="Arial" w:cs="Arial"/>
-                <w:sz w:val="20"/>
               </w:rPr>
             </w:pPr>
             <w:r>
               <w:rPr>
                 <w:rFonts w:ascii="Arial" w:eastAsia="Arial" w:hAnsi="Arial" w:cs="Arial"/>
-                <w:sz w:val="20"/>
               </w:rPr>
               <w:t>Titel</w:t>
             </w:r>
@@ -4326,17 +5017,14 @@
           </w:tcPr>
           <w:p>
             <w:pPr>
-              <w:spacing w:line="240" w:lineRule="auto"/>
               <w:cnfStyle w:val="100000000000" w:firstRow="1" w:lastRow="0" w:firstColumn="0" w:lastColumn="0" w:oddVBand="0" w:evenVBand="0" w:oddHBand="0" w:evenHBand="0" w:firstRowFirstColumn="0" w:firstRowLastColumn="0" w:lastRowFirstColumn="0" w:lastRowLastColumn="0"/>
               <w:rPr>
                 <w:rFonts w:ascii="Arial" w:eastAsia="Arial" w:hAnsi="Arial" w:cs="Arial"/>
-                <w:sz w:val="20"/>
               </w:rPr>
             </w:pPr>
             <w:r>
               <w:rPr>
                 <w:rFonts w:ascii="Arial" w:eastAsia="Arial" w:hAnsi="Arial" w:cs="Arial"/>
-                <w:sz w:val="20"/>
               </w:rPr>
               <w:t>Beschreibung</w:t>
             </w:r>
@@ -4354,10 +5042,8 @@
           </w:tcPr>
           <w:p>
             <w:pPr>
-              <w:spacing w:line="240" w:lineRule="auto"/>
               <w:rPr>
                 <w:rFonts w:ascii="Arial" w:eastAsia="Arial" w:hAnsi="Arial" w:cs="Arial"/>
-                <w:sz w:val="20"/>
               </w:rPr>
             </w:pPr>
             <w:r>
@@ -4367,21 +5053,11 @@
                 <w:sz w:val="32"/>
                 <w:szCs w:val="32"/>
               </w:rPr>
-              <w:t>☻</w:t>
+              <w:t xml:space="preserve">☻ </w:t>
             </w:r>
             <w:r>
               <w:rPr>
                 <w:rFonts w:ascii="Arial" w:eastAsia="Arial" w:hAnsi="Arial" w:cs="Arial"/>
-                <w:color w:val="FFC000"/>
-                <w:sz w:val="32"/>
-                <w:szCs w:val="32"/>
-              </w:rPr>
-              <w:t xml:space="preserve"> </w:t>
-            </w:r>
-            <w:r>
-              <w:rPr>
-                <w:rFonts w:ascii="Arial" w:eastAsia="Arial" w:hAnsi="Arial" w:cs="Arial"/>
-                <w:sz w:val="20"/>
               </w:rPr>
               <w:t>KI-A2.1</w:t>
             </w:r>
@@ -4394,18 +5070,15 @@
           </w:tcPr>
           <w:p>
             <w:pPr>
-              <w:spacing w:line="240" w:lineRule="auto"/>
               <w:jc w:val="center"/>
               <w:cnfStyle w:val="000000100000" w:firstRow="0" w:lastRow="0" w:firstColumn="0" w:lastColumn="0" w:oddVBand="0" w:evenVBand="0" w:oddHBand="1" w:evenHBand="0" w:firstRowFirstColumn="0" w:firstRowLastColumn="0" w:lastRowFirstColumn="0" w:lastRowLastColumn="0"/>
               <w:rPr>
                 <w:rFonts w:ascii="Arial" w:eastAsia="Arial" w:hAnsi="Arial" w:cs="Arial"/>
-                <w:sz w:val="20"/>
               </w:rPr>
             </w:pPr>
             <w:r>
               <w:rPr>
                 <w:rFonts w:ascii="Arial" w:eastAsia="Arial" w:hAnsi="Arial" w:cs="Arial"/>
-                <w:sz w:val="20"/>
               </w:rPr>
               <w:t>Startprojekt</w:t>
             </w:r>
@@ -4418,18 +5091,15 @@
           </w:tcPr>
           <w:p>
             <w:pPr>
-              <w:spacing w:line="240" w:lineRule="auto"/>
               <w:jc w:val="center"/>
               <w:cnfStyle w:val="000000100000" w:firstRow="0" w:lastRow="0" w:firstColumn="0" w:lastColumn="0" w:oddVBand="0" w:evenVBand="0" w:oddHBand="1" w:evenHBand="0" w:firstRowFirstColumn="0" w:firstRowLastColumn="0" w:lastRowFirstColumn="0" w:lastRowLastColumn="0"/>
               <w:rPr>
                 <w:rFonts w:ascii="Arial" w:eastAsia="Arial" w:hAnsi="Arial" w:cs="Arial"/>
-                <w:sz w:val="20"/>
               </w:rPr>
             </w:pPr>
             <w:r>
               <w:rPr>
                 <w:rFonts w:ascii="Arial" w:eastAsia="Arial" w:hAnsi="Arial" w:cs="Arial"/>
-                <w:sz w:val="20"/>
               </w:rPr>
               <w:t>Startprojekt, um den Assistenten kennenzulernen</w:t>
             </w:r>
@@ -4444,7 +5114,6 @@
           </w:tcPr>
           <w:p>
             <w:pPr>
-              <w:spacing w:line="240" w:lineRule="auto"/>
               <w:rPr>
                 <w:rFonts w:ascii="Arial" w:eastAsia="Arial" w:hAnsi="Arial" w:cs="Arial"/>
                 <w:color w:val="FFC000"/>
@@ -4459,21 +5128,11 @@
                 <w:sz w:val="32"/>
                 <w:szCs w:val="32"/>
               </w:rPr>
-              <w:t>☻</w:t>
+              <w:t xml:space="preserve">☻ </w:t>
             </w:r>
             <w:r>
               <w:rPr>
                 <w:rFonts w:ascii="Arial" w:eastAsia="Arial" w:hAnsi="Arial" w:cs="Arial"/>
-                <w:color w:val="FFC000"/>
-                <w:sz w:val="32"/>
-                <w:szCs w:val="32"/>
-              </w:rPr>
-              <w:t xml:space="preserve"> </w:t>
-            </w:r>
-            <w:r>
-              <w:rPr>
-                <w:rFonts w:ascii="Arial" w:eastAsia="Arial" w:hAnsi="Arial" w:cs="Arial"/>
-                <w:sz w:val="20"/>
               </w:rPr>
               <w:t>KI-A2.2</w:t>
             </w:r>
@@ -4486,18 +5145,15 @@
           </w:tcPr>
           <w:p>
             <w:pPr>
-              <w:spacing w:line="240" w:lineRule="auto"/>
               <w:jc w:val="center"/>
               <w:cnfStyle w:val="000000000000" w:firstRow="0" w:lastRow="0" w:firstColumn="0" w:lastColumn="0" w:oddVBand="0" w:evenVBand="0" w:oddHBand="0" w:evenHBand="0" w:firstRowFirstColumn="0" w:firstRowLastColumn="0" w:lastRowFirstColumn="0" w:lastRowLastColumn="0"/>
               <w:rPr>
                 <w:rFonts w:ascii="Arial" w:eastAsia="Arial" w:hAnsi="Arial" w:cs="Arial"/>
-                <w:sz w:val="20"/>
               </w:rPr>
             </w:pPr>
             <w:r>
               <w:rPr>
                 <w:rFonts w:ascii="Arial" w:eastAsia="Arial" w:hAnsi="Arial" w:cs="Arial"/>
-                <w:sz w:val="20"/>
               </w:rPr>
               <w:t>Projekt-Canvas</w:t>
             </w:r>
@@ -4510,18 +5166,15 @@
           </w:tcPr>
           <w:p>
             <w:pPr>
-              <w:spacing w:line="240" w:lineRule="auto"/>
               <w:jc w:val="center"/>
               <w:cnfStyle w:val="000000000000" w:firstRow="0" w:lastRow="0" w:firstColumn="0" w:lastColumn="0" w:oddVBand="0" w:evenVBand="0" w:oddHBand="0" w:evenHBand="0" w:firstRowFirstColumn="0" w:firstRowLastColumn="0" w:lastRowFirstColumn="0" w:lastRowLastColumn="0"/>
               <w:rPr>
                 <w:rFonts w:ascii="Arial" w:eastAsia="Arial" w:hAnsi="Arial" w:cs="Arial"/>
-                <w:sz w:val="20"/>
               </w:rPr>
             </w:pPr>
             <w:r>
               <w:rPr>
                 <w:rFonts w:ascii="Arial" w:eastAsia="Arial" w:hAnsi="Arial" w:cs="Arial"/>
-                <w:sz w:val="20"/>
               </w:rPr>
               <w:t>Canvas zur Herausarbeitung und Einordnung des eigenen Projekts</w:t>
             </w:r>
@@ -4539,10 +5192,8 @@
           </w:tcPr>
           <w:p>
             <w:pPr>
-              <w:spacing w:line="240" w:lineRule="auto"/>
               <w:rPr>
                 <w:rFonts w:ascii="Arial" w:eastAsia="Arial" w:hAnsi="Arial" w:cs="Arial"/>
-                <w:sz w:val="20"/>
               </w:rPr>
             </w:pPr>
             <w:r>
@@ -4552,21 +5203,11 @@
                 <w:sz w:val="32"/>
                 <w:szCs w:val="32"/>
               </w:rPr>
-              <w:t>☻</w:t>
+              <w:t xml:space="preserve">☻ </w:t>
             </w:r>
             <w:r>
               <w:rPr>
                 <w:rFonts w:ascii="Arial" w:eastAsia="Arial" w:hAnsi="Arial" w:cs="Arial"/>
-                <w:color w:val="FFC000"/>
-                <w:sz w:val="32"/>
-                <w:szCs w:val="32"/>
-              </w:rPr>
-              <w:t xml:space="preserve"> </w:t>
-            </w:r>
-            <w:r>
-              <w:rPr>
-                <w:rFonts w:ascii="Arial" w:eastAsia="Arial" w:hAnsi="Arial" w:cs="Arial"/>
-                <w:sz w:val="20"/>
               </w:rPr>
               <w:t>KI-A2.3</w:t>
             </w:r>
@@ -4579,18 +5220,15 @@
           </w:tcPr>
           <w:p>
             <w:pPr>
-              <w:spacing w:line="240" w:lineRule="auto"/>
               <w:jc w:val="center"/>
               <w:cnfStyle w:val="000000100000" w:firstRow="0" w:lastRow="0" w:firstColumn="0" w:lastColumn="0" w:oddVBand="0" w:evenVBand="0" w:oddHBand="1" w:evenHBand="0" w:firstRowFirstColumn="0" w:firstRowLastColumn="0" w:lastRowFirstColumn="0" w:lastRowLastColumn="0"/>
               <w:rPr>
                 <w:rFonts w:ascii="Arial" w:eastAsia="Arial" w:hAnsi="Arial" w:cs="Arial"/>
-                <w:sz w:val="20"/>
               </w:rPr>
             </w:pPr>
             <w:r>
               <w:rPr>
                 <w:rFonts w:ascii="Arial" w:eastAsia="Arial" w:hAnsi="Arial" w:cs="Arial"/>
-                <w:sz w:val="20"/>
               </w:rPr>
               <w:t>Vorlage Handyhalterung</w:t>
             </w:r>
@@ -4603,18 +5241,15 @@
           </w:tcPr>
           <w:p>
             <w:pPr>
-              <w:spacing w:line="240" w:lineRule="auto"/>
               <w:jc w:val="center"/>
               <w:cnfStyle w:val="000000100000" w:firstRow="0" w:lastRow="0" w:firstColumn="0" w:lastColumn="0" w:oddVBand="0" w:evenVBand="0" w:oddHBand="1" w:evenHBand="0" w:firstRowFirstColumn="0" w:firstRowLastColumn="0" w:lastRowFirstColumn="0" w:lastRowLastColumn="0"/>
               <w:rPr>
                 <w:rFonts w:ascii="Arial" w:eastAsia="Arial" w:hAnsi="Arial" w:cs="Arial"/>
-                <w:sz w:val="20"/>
               </w:rPr>
             </w:pPr>
             <w:r>
               <w:rPr>
                 <w:rFonts w:ascii="Arial" w:eastAsia="Arial" w:hAnsi="Arial" w:cs="Arial"/>
-                <w:sz w:val="20"/>
               </w:rPr>
               <w:t>Vorlagen für Handyhalterung zum Ausschneiden</w:t>
             </w:r>
@@ -4629,7 +5264,6 @@
           </w:tcPr>
           <w:p>
             <w:pPr>
-              <w:spacing w:line="240" w:lineRule="auto"/>
               <w:rPr>
                 <w:rFonts w:ascii="Arial" w:eastAsia="Arial" w:hAnsi="Arial" w:cs="Arial"/>
                 <w:color w:val="00B0F0"/>
@@ -4658,7 +5292,6 @@
             <w:r>
               <w:rPr>
                 <w:rFonts w:ascii="Arial" w:eastAsia="Arial" w:hAnsi="Arial" w:cs="Arial"/>
-                <w:sz w:val="20"/>
               </w:rPr>
               <w:t>KI-A2.4</w:t>
             </w:r>
@@ -4671,18 +5304,15 @@
           </w:tcPr>
           <w:p>
             <w:pPr>
-              <w:spacing w:line="240" w:lineRule="auto"/>
               <w:jc w:val="center"/>
               <w:cnfStyle w:val="000000000000" w:firstRow="0" w:lastRow="0" w:firstColumn="0" w:lastColumn="0" w:oddVBand="0" w:evenVBand="0" w:oddHBand="0" w:evenHBand="0" w:firstRowFirstColumn="0" w:firstRowLastColumn="0" w:lastRowFirstColumn="0" w:lastRowLastColumn="0"/>
               <w:rPr>
                 <w:rFonts w:ascii="Arial" w:eastAsia="Arial" w:hAnsi="Arial" w:cs="Arial"/>
-                <w:sz w:val="20"/>
               </w:rPr>
             </w:pPr>
             <w:r>
               <w:rPr>
                 <w:rFonts w:ascii="Arial" w:eastAsia="Arial" w:hAnsi="Arial" w:cs="Arial"/>
-                <w:sz w:val="20"/>
               </w:rPr>
               <w:t>Materialüberblick</w:t>
             </w:r>
@@ -4695,18 +5325,15 @@
           </w:tcPr>
           <w:p>
             <w:pPr>
-              <w:spacing w:line="240" w:lineRule="auto"/>
               <w:jc w:val="center"/>
               <w:cnfStyle w:val="000000000000" w:firstRow="0" w:lastRow="0" w:firstColumn="0" w:lastColumn="0" w:oddVBand="0" w:evenVBand="0" w:oddHBand="0" w:evenHBand="0" w:firstRowFirstColumn="0" w:firstRowLastColumn="0" w:lastRowFirstColumn="0" w:lastRowLastColumn="0"/>
               <w:rPr>
                 <w:rFonts w:ascii="Arial" w:eastAsia="Arial" w:hAnsi="Arial" w:cs="Arial"/>
-                <w:sz w:val="20"/>
               </w:rPr>
             </w:pPr>
             <w:r>
               <w:rPr>
                 <w:rFonts w:ascii="Arial" w:eastAsia="Arial" w:hAnsi="Arial" w:cs="Arial"/>
-                <w:sz w:val="20"/>
               </w:rPr>
               <w:t>Überblick über notwendige Materialien zum Bau des eigenen Assistenten</w:t>
             </w:r>
@@ -4732,23 +5359,15 @@
       <w:pPr>
         <w:spacing w:after="0" w:line="240" w:lineRule="auto"/>
       </w:pPr>
-      <w:bookmarkStart w:id="14" w:name="_heading=h.3as4poj" w:colFirst="0" w:colLast="0"/>
-      <w:bookmarkEnd w:id="14"/>
+      <w:bookmarkStart w:id="135" w:name="_heading=h.3as4poj" w:colFirst="0" w:colLast="0"/>
+      <w:bookmarkEnd w:id="135"/>
       <w:r>
         <w:rPr>
           <w:color w:val="FFC000"/>
           <w:sz w:val="32"/>
           <w:szCs w:val="32"/>
         </w:rPr>
-        <w:t>☻</w:t>
-      </w:r>
-      <w:r>
-        <w:rPr>
-          <w:color w:val="FFC000"/>
-          <w:sz w:val="32"/>
-          <w:szCs w:val="32"/>
-        </w:rPr>
-        <w:t xml:space="preserve"> </w:t>
+        <w:t xml:space="preserve">☻ </w:t>
       </w:r>
       <w:r>
         <w:t xml:space="preserve">Material für Schülerinnen und Schüler </w:t>
@@ -4764,15 +5383,7 @@
           <w:sz w:val="32"/>
           <w:szCs w:val="32"/>
         </w:rPr>
-        <w:t>☻</w:t>
-      </w:r>
-      <w:r>
-        <w:rPr>
-          <w:color w:val="00B050"/>
-          <w:sz w:val="32"/>
-          <w:szCs w:val="32"/>
-        </w:rPr>
-        <w:t xml:space="preserve"> </w:t>
+        <w:t xml:space="preserve">☻ </w:t>
       </w:r>
       <w:r>
         <w:t>Material für Lehrkräfte sowie Unternehmensvertreterinnen und Unternehmensvertreter</w:t>
@@ -4785,15 +5396,7 @@
           <w:sz w:val="32"/>
           <w:szCs w:val="32"/>
         </w:rPr>
-        <w:t>☻</w:t>
-      </w:r>
-      <w:r>
-        <w:rPr>
-          <w:color w:val="00B0F0"/>
-          <w:sz w:val="32"/>
-          <w:szCs w:val="32"/>
-        </w:rPr>
-        <w:t xml:space="preserve"> </w:t>
+        <w:t xml:space="preserve">☻ </w:t>
       </w:r>
       <w:r>
         <w:t>Zusatzmaterial</w:t>
@@ -4806,12 +5409,25 @@
           <w:ilvl w:val="0"/>
           <w:numId w:val="3"/>
         </w:numPr>
+        <w:spacing w:before="200"/>
+        <w:pPrChange w:id="136" w:author="Imke Endjer" w:date="2023-02-23T11:15:00Z">
+          <w:pPr>
+            <w:pStyle w:val="berschrift1"/>
+            <w:numPr>
+              <w:numId w:val="3"/>
+            </w:numPr>
+            <w:tabs>
+              <w:tab w:val="clear" w:pos="720"/>
+            </w:tabs>
+            <w:ind w:left="432" w:hanging="432"/>
+          </w:pPr>
+        </w:pPrChange>
       </w:pPr>
-      <w:bookmarkStart w:id="15" w:name="_Toc103785178"/>
+      <w:bookmarkStart w:id="137" w:name="_Toc103785178"/>
       <w:r>
         <w:t>Glossar</w:t>
       </w:r>
-      <w:bookmarkEnd w:id="15"/>
+      <w:bookmarkEnd w:id="137"/>
     </w:p>
     <w:tbl>
       <w:tblPr>
@@ -4844,16 +5460,13 @@
           </w:tcPr>
           <w:p>
             <w:pPr>
-              <w:spacing w:line="240" w:lineRule="auto"/>
               <w:rPr>
                 <w:rFonts w:ascii="Arial" w:eastAsia="Arial" w:hAnsi="Arial" w:cs="Arial"/>
-                <w:sz w:val="20"/>
               </w:rPr>
             </w:pPr>
             <w:r>
               <w:rPr>
                 <w:rFonts w:ascii="Arial" w:eastAsia="Arial" w:hAnsi="Arial" w:cs="Arial"/>
-                <w:sz w:val="20"/>
               </w:rPr>
               <w:t>Begriff</w:t>
             </w:r>
@@ -4865,17 +5478,14 @@
           </w:tcPr>
           <w:p>
             <w:pPr>
-              <w:spacing w:line="240" w:lineRule="auto"/>
               <w:cnfStyle w:val="100000000000" w:firstRow="1" w:lastRow="0" w:firstColumn="0" w:lastColumn="0" w:oddVBand="0" w:evenVBand="0" w:oddHBand="0" w:evenHBand="0" w:firstRowFirstColumn="0" w:firstRowLastColumn="0" w:lastRowFirstColumn="0" w:lastRowLastColumn="0"/>
               <w:rPr>
                 <w:rFonts w:ascii="Arial" w:eastAsia="Arial" w:hAnsi="Arial" w:cs="Arial"/>
-                <w:sz w:val="20"/>
               </w:rPr>
             </w:pPr>
             <w:r>
               <w:rPr>
                 <w:rFonts w:ascii="Arial" w:eastAsia="Arial" w:hAnsi="Arial" w:cs="Arial"/>
-                <w:sz w:val="20"/>
               </w:rPr>
               <w:t>Erläuterung</w:t>
             </w:r>
@@ -4893,16 +5503,13 @@
           </w:tcPr>
           <w:p>
             <w:pPr>
-              <w:spacing w:line="240" w:lineRule="auto"/>
               <w:rPr>
                 <w:rFonts w:ascii="Arial" w:eastAsia="Arial" w:hAnsi="Arial" w:cs="Arial"/>
-                <w:sz w:val="20"/>
               </w:rPr>
             </w:pPr>
             <w:r>
               <w:rPr>
                 <w:rFonts w:ascii="Arial" w:eastAsia="Arial" w:hAnsi="Arial" w:cs="Arial"/>
-                <w:sz w:val="20"/>
               </w:rPr>
               <w:t>Maschinelles Lernen</w:t>
             </w:r>
@@ -4914,24 +5521,20 @@
           </w:tcPr>
           <w:p>
             <w:pPr>
-              <w:spacing w:line="240" w:lineRule="auto"/>
               <w:cnfStyle w:val="000000100000" w:firstRow="0" w:lastRow="0" w:firstColumn="0" w:lastColumn="0" w:oddVBand="0" w:evenVBand="0" w:oddHBand="1" w:evenHBand="0" w:firstRowFirstColumn="0" w:firstRowLastColumn="0" w:lastRowFirstColumn="0" w:lastRowLastColumn="0"/>
               <w:rPr>
                 <w:rFonts w:ascii="Arial" w:eastAsia="Arial" w:hAnsi="Arial" w:cs="Arial"/>
-                <w:sz w:val="20"/>
               </w:rPr>
             </w:pPr>
             <w:r>
               <w:rPr>
                 <w:rFonts w:ascii="Arial" w:eastAsia="Arial" w:hAnsi="Arial" w:cs="Arial"/>
-                <w:sz w:val="20"/>
               </w:rPr>
               <w:t xml:space="preserve">Beim </w:t>
             </w:r>
             <w:r>
               <w:rPr>
                 <w:rFonts w:ascii="Arial" w:eastAsia="Arial" w:hAnsi="Arial" w:cs="Arial"/>
-                <w:sz w:val="20"/>
                 <w:u w:val="single"/>
               </w:rPr>
               <w:t>maschinellen Lernen (ML)</w:t>
@@ -4939,7 +5542,6 @@
             <w:r>
               <w:rPr>
                 <w:rFonts w:ascii="Arial" w:eastAsia="Arial" w:hAnsi="Arial" w:cs="Arial"/>
-                <w:sz w:val="20"/>
               </w:rPr>
               <w:t xml:space="preserve"> leiten Computer Zusammenhänge aus Daten bzw. Erfahrungen ab. Das Gelernte wird in einem Modell gespeichert.</w:t>
             </w:r>
@@ -4954,17 +5556,15 @@
           </w:tcPr>
           <w:p>
             <w:pPr>
-              <w:spacing w:line="240" w:lineRule="auto"/>
               <w:rPr>
                 <w:rFonts w:ascii="Arial" w:eastAsia="Arial" w:hAnsi="Arial" w:cs="Arial"/>
-                <w:sz w:val="20"/>
               </w:rPr>
             </w:pPr>
             <w:r>
               <w:rPr>
                 <w:rFonts w:ascii="Arial" w:eastAsia="Arial" w:hAnsi="Arial" w:cs="Arial"/>
-                <w:sz w:val="20"/>
-              </w:rPr>
+              </w:rPr>
+              <w:lastRenderedPageBreak/>
               <w:t>Überwachtes Lernen</w:t>
             </w:r>
           </w:p>
@@ -4975,26 +5575,16 @@
           </w:tcPr>
           <w:p>
             <w:pPr>
-              <w:spacing w:line="240" w:lineRule="auto"/>
               <w:cnfStyle w:val="000000000000" w:firstRow="0" w:lastRow="0" w:firstColumn="0" w:lastColumn="0" w:oddVBand="0" w:evenVBand="0" w:oddHBand="0" w:evenHBand="0" w:firstRowFirstColumn="0" w:firstRowLastColumn="0" w:lastRowFirstColumn="0" w:lastRowLastColumn="0"/>
               <w:rPr>
                 <w:rFonts w:ascii="Arial" w:eastAsia="Arial" w:hAnsi="Arial" w:cs="Arial"/>
-                <w:sz w:val="20"/>
               </w:rPr>
             </w:pPr>
             <w:r>
               <w:rPr>
                 <w:rFonts w:ascii="Arial" w:eastAsia="Arial" w:hAnsi="Arial" w:cs="Arial"/>
-                <w:sz w:val="20"/>
-              </w:rPr>
-              <w:t>Bei überwachtem Lernen wird aus beschrifteten Daten eine Zuordnung von Daten zur Beschriftung gelernt, die dann auf weitere, un</w:t>
-            </w:r>
-            <w:r>
-              <w:rPr>
-                <w:rFonts w:ascii="Arial" w:eastAsia="Arial" w:hAnsi="Arial" w:cs="Arial"/>
-                <w:sz w:val="20"/>
-              </w:rPr>
-              <w:t>beschriftete Daten angewendet werden kann.</w:t>
+              </w:rPr>
+              <w:t>Bei überwachtem Lernen wird aus beschrifteten Daten eine Zuordnung von Daten zur Beschriftung gelernt, die dann auf weitere, unbeschriftete Daten angewendet werden kann.</w:t>
             </w:r>
           </w:p>
         </w:tc>
@@ -5010,16 +5600,13 @@
           </w:tcPr>
           <w:p>
             <w:pPr>
-              <w:spacing w:line="240" w:lineRule="auto"/>
               <w:rPr>
                 <w:rFonts w:ascii="Arial" w:eastAsia="Arial" w:hAnsi="Arial" w:cs="Arial"/>
-                <w:sz w:val="20"/>
               </w:rPr>
             </w:pPr>
             <w:r>
               <w:rPr>
                 <w:rFonts w:ascii="Arial" w:eastAsia="Arial" w:hAnsi="Arial" w:cs="Arial"/>
-                <w:sz w:val="20"/>
               </w:rPr>
               <w:t>Trainingsdaten</w:t>
             </w:r>
@@ -5031,17 +5618,14 @@
           </w:tcPr>
           <w:p>
             <w:pPr>
-              <w:spacing w:line="240" w:lineRule="auto"/>
               <w:cnfStyle w:val="000000100000" w:firstRow="0" w:lastRow="0" w:firstColumn="0" w:lastColumn="0" w:oddVBand="0" w:evenVBand="0" w:oddHBand="1" w:evenHBand="0" w:firstRowFirstColumn="0" w:firstRowLastColumn="0" w:lastRowFirstColumn="0" w:lastRowLastColumn="0"/>
               <w:rPr>
                 <w:rFonts w:ascii="Arial" w:eastAsia="Arial" w:hAnsi="Arial" w:cs="Arial"/>
-                <w:sz w:val="20"/>
               </w:rPr>
             </w:pPr>
             <w:r>
               <w:rPr>
                 <w:rFonts w:ascii="Arial" w:eastAsia="Arial" w:hAnsi="Arial" w:cs="Arial"/>
-                <w:sz w:val="20"/>
               </w:rPr>
               <w:t>Trainingsdaten sind Daten, die zur Erstellung eines mit überwachtem Lernen trainierten Modells herangezogen werden.</w:t>
             </w:r>
@@ -5056,16 +5640,13 @@
           </w:tcPr>
           <w:p>
             <w:pPr>
-              <w:spacing w:line="240" w:lineRule="auto"/>
               <w:rPr>
                 <w:rFonts w:ascii="Arial" w:eastAsia="Arial" w:hAnsi="Arial" w:cs="Arial"/>
-                <w:sz w:val="20"/>
               </w:rPr>
             </w:pPr>
             <w:r>
               <w:rPr>
                 <w:rFonts w:ascii="Arial" w:eastAsia="Arial" w:hAnsi="Arial" w:cs="Arial"/>
-                <w:sz w:val="20"/>
               </w:rPr>
               <w:t>Testdaten</w:t>
             </w:r>
@@ -5077,26 +5658,16 @@
           </w:tcPr>
           <w:p>
             <w:pPr>
-              <w:spacing w:line="240" w:lineRule="auto"/>
               <w:cnfStyle w:val="000000000000" w:firstRow="0" w:lastRow="0" w:firstColumn="0" w:lastColumn="0" w:oddVBand="0" w:evenVBand="0" w:oddHBand="0" w:evenHBand="0" w:firstRowFirstColumn="0" w:firstRowLastColumn="0" w:lastRowFirstColumn="0" w:lastRowLastColumn="0"/>
               <w:rPr>
                 <w:rFonts w:ascii="Arial" w:eastAsia="Arial" w:hAnsi="Arial" w:cs="Arial"/>
-                <w:sz w:val="20"/>
               </w:rPr>
             </w:pPr>
             <w:r>
               <w:rPr>
                 <w:rFonts w:ascii="Arial" w:eastAsia="Arial" w:hAnsi="Arial" w:cs="Arial"/>
-                <w:sz w:val="20"/>
-              </w:rPr>
-              <w:t>Testdaten werden genutzt, um zu beurteilen (zu „testen“), ob ein Model</w:t>
-            </w:r>
-            <w:r>
-              <w:rPr>
-                <w:rFonts w:ascii="Arial" w:eastAsia="Arial" w:hAnsi="Arial" w:cs="Arial"/>
-                <w:sz w:val="20"/>
-              </w:rPr>
-              <w:t>l zufriedenstellende Ergebnisse liefert. Sie sollten nicht Teil des Trainingsprozesses sein.</w:t>
+              </w:rPr>
+              <w:t>Testdaten werden genutzt, um zu beurteilen (zu „testen“), ob ein Modell zufriedenstellende Ergebnisse liefert. Sie sollten nicht Teil des Trainingsprozesses sein.</w:t>
             </w:r>
           </w:p>
         </w:tc>
@@ -5104,6 +5675,7 @@
       <w:tr>
         <w:trPr>
           <w:cnfStyle w:val="000000100000" w:firstRow="0" w:lastRow="0" w:firstColumn="0" w:lastColumn="0" w:oddVBand="0" w:evenVBand="0" w:oddHBand="1" w:evenHBand="0" w:firstRowFirstColumn="0" w:firstRowLastColumn="0" w:lastRowFirstColumn="0" w:lastRowLastColumn="0"/>
+          <w:del w:id="138" w:author="Imke Endjer" w:date="2023-02-23T11:14:00Z"/>
         </w:trPr>
         <w:tc>
           <w:tcPr>
@@ -5112,10 +5684,9 @@
           </w:tcPr>
           <w:p>
             <w:pPr>
-              <w:spacing w:line="240" w:lineRule="auto"/>
-              <w:rPr>
+              <w:rPr>
+                <w:del w:id="139" w:author="Imke Endjer" w:date="2023-02-23T11:14:00Z"/>
                 <w:rFonts w:ascii="Arial" w:eastAsia="Arial" w:hAnsi="Arial" w:cs="Arial"/>
-                <w:sz w:val="20"/>
               </w:rPr>
             </w:pPr>
           </w:p>
@@ -5126,11 +5697,10 @@
           </w:tcPr>
           <w:p>
             <w:pPr>
-              <w:spacing w:line="240" w:lineRule="auto"/>
               <w:cnfStyle w:val="000000100000" w:firstRow="0" w:lastRow="0" w:firstColumn="0" w:lastColumn="0" w:oddVBand="0" w:evenVBand="0" w:oddHBand="1" w:evenHBand="0" w:firstRowFirstColumn="0" w:firstRowLastColumn="0" w:lastRowFirstColumn="0" w:lastRowLastColumn="0"/>
               <w:rPr>
+                <w:del w:id="140" w:author="Imke Endjer" w:date="2023-02-23T11:14:00Z"/>
                 <w:rFonts w:ascii="Arial" w:eastAsia="Arial" w:hAnsi="Arial" w:cs="Arial"/>
-                <w:sz w:val="20"/>
               </w:rPr>
             </w:pPr>
           </w:p>
@@ -5138,8 +5708,13 @@
       </w:tr>
     </w:tbl>
     <w:p>
-      <w:bookmarkStart w:id="16" w:name="_heading=h.lnxbz9" w:colFirst="0" w:colLast="0"/>
-      <w:bookmarkEnd w:id="16"/>
+      <w:pPr>
+        <w:rPr>
+          <w:del w:id="141" w:author="Imke Endjer" w:date="2023-02-23T11:15:00Z"/>
+        </w:rPr>
+      </w:pPr>
+      <w:bookmarkStart w:id="142" w:name="_heading=h.lnxbz9" w:colFirst="0" w:colLast="0"/>
+      <w:bookmarkEnd w:id="142"/>
     </w:p>
     <w:p>
       <w:pPr>
@@ -5151,9 +5726,11 @@
           <w:szCs w:val="28"/>
         </w:rPr>
       </w:pPr>
-      <w:r>
-        <w:br w:type="page"/>
-      </w:r>
+      <w:del w:id="143" w:author="Imke Endjer" w:date="2023-02-23T11:15:00Z">
+        <w:r>
+          <w:br w:type="page"/>
+        </w:r>
+      </w:del>
     </w:p>
     <w:p>
       <w:pPr>
@@ -5163,11 +5740,11 @@
           <w:numId w:val="3"/>
         </w:numPr>
       </w:pPr>
-      <w:bookmarkStart w:id="17" w:name="_Toc103785179"/>
+      <w:bookmarkStart w:id="144" w:name="_Toc103785179"/>
       <w:r>
         <w:t>Fragen, Feedback, Anregungen</w:t>
       </w:r>
-      <w:bookmarkEnd w:id="17"/>
+      <w:bookmarkEnd w:id="144"/>
     </w:p>
     <w:p>
       <w:pPr>
@@ -5190,10 +5767,7 @@
       </w:r>
       <w:proofErr w:type="spellEnd"/>
       <w:r>
-        <w:t xml:space="preserve"> Questions) für die neuen KI-Module aufbauen oder die Module weit</w:t>
-      </w:r>
-      <w:r>
-        <w:t xml:space="preserve">er entwickeln. </w:t>
+        <w:t xml:space="preserve"> Questions) für die neuen KI-Module aufbauen oder die Module weiter entwickeln. </w:t>
       </w:r>
     </w:p>
     <w:p>
@@ -5355,6 +5929,7 @@
     <w:p>
       <w:pPr>
         <w:rPr>
+          <w:del w:id="145" w:author="Imke Endjer" w:date="2023-02-23T11:36:00Z"/>
           <w:sz w:val="24"/>
           <w:szCs w:val="24"/>
         </w:rPr>
@@ -5363,6 +5938,7 @@
     <w:p>
       <w:pPr>
         <w:rPr>
+          <w:del w:id="146" w:author="Imke Endjer" w:date="2023-02-23T11:36:00Z"/>
           <w:sz w:val="24"/>
           <w:szCs w:val="24"/>
         </w:rPr>
@@ -5371,6 +5947,7 @@
     <w:p>
       <w:pPr>
         <w:rPr>
+          <w:del w:id="147" w:author="Imke Endjer" w:date="2023-02-23T11:36:00Z"/>
           <w:sz w:val="24"/>
           <w:szCs w:val="24"/>
         </w:rPr>
@@ -5379,6 +5956,7 @@
     <w:p>
       <w:pPr>
         <w:rPr>
+          <w:del w:id="148" w:author="Imke Endjer" w:date="2023-02-23T11:36:00Z"/>
           <w:sz w:val="24"/>
           <w:szCs w:val="24"/>
         </w:rPr>
@@ -5387,6 +5965,7 @@
     <w:p>
       <w:pPr>
         <w:rPr>
+          <w:del w:id="149" w:author="Imke Endjer" w:date="2023-02-23T11:36:00Z"/>
           <w:sz w:val="24"/>
           <w:szCs w:val="24"/>
         </w:rPr>
@@ -5395,6 +5974,7 @@
     <w:p>
       <w:pPr>
         <w:rPr>
+          <w:del w:id="150" w:author="Imke Endjer" w:date="2023-02-23T11:36:00Z"/>
           <w:sz w:val="24"/>
           <w:szCs w:val="24"/>
         </w:rPr>
@@ -5403,6 +5983,7 @@
     <w:p>
       <w:pPr>
         <w:rPr>
+          <w:del w:id="151" w:author="Imke Endjer" w:date="2023-02-23T11:36:00Z"/>
           <w:sz w:val="24"/>
           <w:szCs w:val="24"/>
         </w:rPr>
@@ -5538,7 +6119,7 @@
               <wp:extent cx="4405630" cy="243840"/>
               <wp:effectExtent l="4445" t="0" r="0" b="0"/>
               <wp:wrapNone/>
-              <wp:docPr id="336" name=""/>
+              <wp:docPr id="336" name="Rechteck 336"/>
               <wp:cNvGraphicFramePr/>
               <a:graphic xmlns:a="http://schemas.openxmlformats.org/drawingml/2006/main">
                 <a:graphicData uri="http://schemas.microsoft.com/office/word/2010/wordprocessingShape">
@@ -5568,7 +6149,7 @@
                           </w:pPr>
                           <w:r>
                             <w:rPr>
-                              <w:rFonts w:ascii="Helvetica Neue" w:eastAsia="Helvetica Neue" w:hAnsi="Helvetica Neue" w:cs="Helvetica Neue"/>
+                              <w:rFonts w:ascii="helvetica neue" w:eastAsia="helvetica neue" w:hAnsi="helvetica neue" w:cs="helvetica neue"/>
                               <w:color w:val="A6A6A6"/>
                               <w:sz w:val="14"/>
                             </w:rPr>
@@ -5576,7 +6157,7 @@
                           </w:r>
                           <w:r>
                             <w:rPr>
-                              <w:rFonts w:ascii="Helvetica Neue" w:eastAsia="Helvetica Neue" w:hAnsi="Helvetica Neue" w:cs="Helvetica Neue"/>
+                              <w:rFonts w:ascii="helvetica neue" w:eastAsia="helvetica neue" w:hAnsi="helvetica neue" w:cs="helvetica neue"/>
                               <w:color w:val="A6A6A6"/>
                               <w:sz w:val="14"/>
                             </w:rPr>
@@ -5609,7 +6190,7 @@
         </mc:Choice>
         <mc:Fallback>
           <w:pict>
-            <v:rect w14:anchorId="6D1B38E9" id="_x0000_s1031" style="position:absolute;margin-left:312.25pt;margin-top:-264.35pt;width:346.9pt;height:19.2pt;rotation:-90;z-index:251660288;visibility:visible;mso-wrap-style:square;mso-width-percent:0;mso-height-percent:0;mso-wrap-distance-left:9pt;mso-wrap-distance-top:0;mso-wrap-distance-right:9pt;mso-wrap-distance-bottom:0;mso-position-horizontal:absolute;mso-position-horizontal-relative:text;mso-position-vertical:absolute;mso-position-vertical-relative:text;mso-width-percent:0;mso-height-percent:0;mso-width-relative:margin;mso-height-relative:margin;v-text-anchor:top" o:gfxdata="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" stroked="f">
+            <v:rect w14:anchorId="6D1B38E9" id="Rechteck 336" o:spid="_x0000_s1031" style="position:absolute;margin-left:312.25pt;margin-top:-264.35pt;width:346.9pt;height:19.2pt;rotation:-90;z-index:251660288;visibility:visible;mso-wrap-style:square;mso-width-percent:0;mso-height-percent:0;mso-wrap-distance-left:9pt;mso-wrap-distance-top:0;mso-wrap-distance-right:9pt;mso-wrap-distance-bottom:0;mso-position-horizontal:absolute;mso-position-horizontal-relative:text;mso-position-vertical:absolute;mso-position-vertical-relative:text;mso-width-percent:0;mso-height-percent:0;mso-width-relative:margin;mso-height-relative:margin;v-text-anchor:top" o:gfxdata="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" stroked="f">
               <v:textbox inset="2.53958mm,1.2694mm,2.53958mm,1.2694mm">
                 <w:txbxContent>
                   <w:p>
@@ -5619,7 +6200,7 @@
                     </w:pPr>
                     <w:r>
                       <w:rPr>
-                        <w:rFonts w:ascii="Helvetica Neue" w:eastAsia="Helvetica Neue" w:hAnsi="Helvetica Neue" w:cs="Helvetica Neue"/>
+                        <w:rFonts w:ascii="helvetica neue" w:eastAsia="helvetica neue" w:hAnsi="helvetica neue" w:cs="helvetica neue"/>
                         <w:color w:val="A6A6A6"/>
                         <w:sz w:val="14"/>
                       </w:rPr>
@@ -5627,7 +6208,7 @@
                     </w:r>
                     <w:r>
                       <w:rPr>
-                        <w:rFonts w:ascii="Helvetica Neue" w:eastAsia="Helvetica Neue" w:hAnsi="Helvetica Neue" w:cs="Helvetica Neue"/>
+                        <w:rFonts w:ascii="helvetica neue" w:eastAsia="helvetica neue" w:hAnsi="helvetica neue" w:cs="helvetica neue"/>
                         <w:color w:val="A6A6A6"/>
                         <w:sz w:val="14"/>
                       </w:rPr>
@@ -5846,7 +6427,7 @@
               <wp:extent cx="5605200" cy="31750"/>
               <wp:effectExtent l="0" t="0" r="0" b="0"/>
               <wp:wrapNone/>
-              <wp:docPr id="332" name=""/>
+              <wp:docPr id="332" name="Gerade Verbindung mit Pfeil 332"/>
               <wp:cNvGraphicFramePr/>
               <a:graphic xmlns:a="http://schemas.openxmlformats.org/drawingml/2006/main">
                 <a:graphicData uri="http://schemas.microsoft.com/office/word/2010/wordprocessingShape">
@@ -6321,7 +6902,7 @@
               <wp:extent cx="7693200" cy="31750"/>
               <wp:effectExtent l="0" t="0" r="0" b="0"/>
               <wp:wrapSquare wrapText="bothSides" distT="0" distB="0" distL="114300" distR="114300"/>
-              <wp:docPr id="337" name=""/>
+              <wp:docPr id="337" name="Gerade Verbindung mit Pfeil 337"/>
               <wp:cNvGraphicFramePr/>
               <a:graphic xmlns:a="http://schemas.openxmlformats.org/drawingml/2006/main">
                 <a:graphicData uri="http://schemas.microsoft.com/office/word/2010/wordprocessingShape">
@@ -6463,7 +7044,7 @@
               <wp:extent cx="4302125" cy="328930"/>
               <wp:effectExtent l="5398" t="13652" r="8572" b="8573"/>
               <wp:wrapNone/>
-              <wp:docPr id="333" name=""/>
+              <wp:docPr id="333" name="Rechteck 333"/>
               <wp:cNvGraphicFramePr/>
               <a:graphic xmlns:a="http://schemas.openxmlformats.org/drawingml/2006/main">
                 <a:graphicData uri="http://schemas.microsoft.com/office/word/2010/wordprocessingShape">
@@ -6532,7 +7113,7 @@
         </mc:Choice>
         <mc:Fallback>
           <w:pict>
-            <v:rect w14:anchorId="07F04093" id="_x0000_s1032" style="position:absolute;margin-left:317.2pt;margin-top:-261.1pt;width:338.75pt;height:25.9pt;rotation:-5898242fd;z-index:251668480;visibility:visible;mso-wrap-style:square;mso-width-percent:0;mso-height-percent:0;mso-wrap-distance-left:9pt;mso-wrap-distance-top:0;mso-wrap-distance-right:9pt;mso-wrap-distance-bottom:0;mso-position-horizontal:absolute;mso-position-horizontal-relative:text;mso-position-vertical:absolute;mso-position-vertical-relative:text;mso-width-percent:0;mso-height-percent:0;mso-width-relative:margin;mso-height-relative:margin;v-text-anchor:top" o:gfxdata="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" stroked="f">
+            <v:rect w14:anchorId="07F04093" id="Rechteck 333" o:spid="_x0000_s1032" style="position:absolute;margin-left:317.2pt;margin-top:-261.1pt;width:338.75pt;height:25.9pt;rotation:-5898242fd;z-index:251668480;visibility:visible;mso-wrap-style:square;mso-width-percent:0;mso-height-percent:0;mso-wrap-distance-left:9pt;mso-wrap-distance-top:0;mso-wrap-distance-right:9pt;mso-wrap-distance-bottom:0;mso-position-horizontal:absolute;mso-position-horizontal-relative:text;mso-position-vertical:absolute;mso-position-vertical-relative:text;mso-width-percent:0;mso-height-percent:0;mso-width-relative:margin;mso-height-relative:margin;v-text-anchor:top" o:gfxdata="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" stroked="f">
               <v:textbox inset="2.53958mm,1.2694mm,2.53958mm,1.2694mm">
                 <w:txbxContent>
                   <w:p>
@@ -6682,6 +7263,16 @@
       </w:rPr>
       <w:t>Modul KI-A2 – Mein persönlicher Assistent</w:t>
     </w:r>
+    <w:ins w:id="152" w:author="Imke Endjer" w:date="2023-02-23T11:16:00Z">
+      <w:r>
+        <w:rPr>
+          <w:color w:val="000000"/>
+          <w:sz w:val="18"/>
+          <w:szCs w:val="18"/>
+        </w:rPr>
+        <w:t xml:space="preserve">  </w:t>
+      </w:r>
+    </w:ins>
     <w:r>
       <w:rPr>
         <w:color w:val="000000"/>
@@ -6814,7 +7405,7 @@
           <wp:extent cx="647750" cy="146050"/>
           <wp:effectExtent l="0" t="0" r="0" b="0"/>
           <wp:wrapNone/>
-          <wp:docPr id="344" name="image11.png"/>
+          <wp:docPr id="7" name="image11.png"/>
           <wp:cNvGraphicFramePr/>
           <a:graphic xmlns:a="http://schemas.openxmlformats.org/drawingml/2006/main">
             <a:graphicData uri="http://schemas.openxmlformats.org/drawingml/2006/picture">
@@ -7125,7 +7716,7 @@
               <wp:extent cx="7563600" cy="31750"/>
               <wp:effectExtent l="0" t="0" r="0" b="0"/>
               <wp:wrapSquare wrapText="bothSides" distT="0" distB="0" distL="114300" distR="114300"/>
-              <wp:docPr id="334" name=""/>
+              <wp:docPr id="334" name="Gerade Verbindung mit Pfeil 334"/>
               <wp:cNvGraphicFramePr/>
               <a:graphic xmlns:a="http://schemas.openxmlformats.org/drawingml/2006/main">
                 <a:graphicData uri="http://schemas.microsoft.com/office/word/2010/wordprocessingShape">
@@ -7284,7 +7875,7 @@
         <w:ind w:left="720" w:hanging="360"/>
       </w:pPr>
       <w:rPr>
-        <w:rFonts w:ascii="Noto Sans Symbols" w:eastAsia="Noto Sans Symbols" w:hAnsi="Noto Sans Symbols" w:cs="Noto Sans Symbols"/>
+        <w:rFonts w:ascii="noto sans symbols" w:eastAsia="noto sans symbols" w:hAnsi="noto sans symbols" w:cs="noto sans symbols"/>
       </w:rPr>
     </w:lvl>
     <w:lvl w:ilvl="1">
@@ -7308,7 +7899,7 @@
         <w:ind w:left="2160" w:hanging="360"/>
       </w:pPr>
       <w:rPr>
-        <w:rFonts w:ascii="Noto Sans Symbols" w:eastAsia="Noto Sans Symbols" w:hAnsi="Noto Sans Symbols" w:cs="Noto Sans Symbols"/>
+        <w:rFonts w:ascii="noto sans symbols" w:eastAsia="noto sans symbols" w:hAnsi="noto sans symbols" w:cs="noto sans symbols"/>
       </w:rPr>
     </w:lvl>
     <w:lvl w:ilvl="3">
@@ -7320,7 +7911,7 @@
         <w:ind w:left="2880" w:hanging="360"/>
       </w:pPr>
       <w:rPr>
-        <w:rFonts w:ascii="Noto Sans Symbols" w:eastAsia="Noto Sans Symbols" w:hAnsi="Noto Sans Symbols" w:cs="Noto Sans Symbols"/>
+        <w:rFonts w:ascii="noto sans symbols" w:eastAsia="noto sans symbols" w:hAnsi="noto sans symbols" w:cs="noto sans symbols"/>
       </w:rPr>
     </w:lvl>
     <w:lvl w:ilvl="4">
@@ -7344,7 +7935,7 @@
         <w:ind w:left="4320" w:hanging="360"/>
       </w:pPr>
       <w:rPr>
-        <w:rFonts w:ascii="Noto Sans Symbols" w:eastAsia="Noto Sans Symbols" w:hAnsi="Noto Sans Symbols" w:cs="Noto Sans Symbols"/>
+        <w:rFonts w:ascii="noto sans symbols" w:eastAsia="noto sans symbols" w:hAnsi="noto sans symbols" w:cs="noto sans symbols"/>
       </w:rPr>
     </w:lvl>
     <w:lvl w:ilvl="6">
@@ -7356,7 +7947,7 @@
         <w:ind w:left="5040" w:hanging="360"/>
       </w:pPr>
       <w:rPr>
-        <w:rFonts w:ascii="Noto Sans Symbols" w:eastAsia="Noto Sans Symbols" w:hAnsi="Noto Sans Symbols" w:cs="Noto Sans Symbols"/>
+        <w:rFonts w:ascii="noto sans symbols" w:eastAsia="noto sans symbols" w:hAnsi="noto sans symbols" w:cs="noto sans symbols"/>
       </w:rPr>
     </w:lvl>
     <w:lvl w:ilvl="7">
@@ -7380,7 +7971,7 @@
         <w:ind w:left="6480" w:hanging="360"/>
       </w:pPr>
       <w:rPr>
-        <w:rFonts w:ascii="Noto Sans Symbols" w:eastAsia="Noto Sans Symbols" w:hAnsi="Noto Sans Symbols" w:cs="Noto Sans Symbols"/>
+        <w:rFonts w:ascii="noto sans symbols" w:eastAsia="noto sans symbols" w:hAnsi="noto sans symbols" w:cs="noto sans symbols"/>
       </w:rPr>
     </w:lvl>
   </w:abstractNum>
@@ -7737,7 +8328,7 @@
         <w:ind w:left="720" w:hanging="360"/>
       </w:pPr>
       <w:rPr>
-        <w:rFonts w:ascii="Noto Sans Symbols" w:eastAsia="Noto Sans Symbols" w:hAnsi="Noto Sans Symbols" w:cs="Noto Sans Symbols"/>
+        <w:rFonts w:ascii="noto sans symbols" w:eastAsia="noto sans symbols" w:hAnsi="noto sans symbols" w:cs="noto sans symbols"/>
       </w:rPr>
     </w:lvl>
     <w:lvl w:ilvl="1">
@@ -7761,7 +8352,7 @@
         <w:ind w:left="2160" w:hanging="360"/>
       </w:pPr>
       <w:rPr>
-        <w:rFonts w:ascii="Noto Sans Symbols" w:eastAsia="Noto Sans Symbols" w:hAnsi="Noto Sans Symbols" w:cs="Noto Sans Symbols"/>
+        <w:rFonts w:ascii="noto sans symbols" w:eastAsia="noto sans symbols" w:hAnsi="noto sans symbols" w:cs="noto sans symbols"/>
       </w:rPr>
     </w:lvl>
     <w:lvl w:ilvl="3">
@@ -7773,7 +8364,7 @@
         <w:ind w:left="2880" w:hanging="360"/>
       </w:pPr>
       <w:rPr>
-        <w:rFonts w:ascii="Noto Sans Symbols" w:eastAsia="Noto Sans Symbols" w:hAnsi="Noto Sans Symbols" w:cs="Noto Sans Symbols"/>
+        <w:rFonts w:ascii="noto sans symbols" w:eastAsia="noto sans symbols" w:hAnsi="noto sans symbols" w:cs="noto sans symbols"/>
       </w:rPr>
     </w:lvl>
     <w:lvl w:ilvl="4">
@@ -7797,7 +8388,7 @@
         <w:ind w:left="4320" w:hanging="360"/>
       </w:pPr>
       <w:rPr>
-        <w:rFonts w:ascii="Noto Sans Symbols" w:eastAsia="Noto Sans Symbols" w:hAnsi="Noto Sans Symbols" w:cs="Noto Sans Symbols"/>
+        <w:rFonts w:ascii="noto sans symbols" w:eastAsia="noto sans symbols" w:hAnsi="noto sans symbols" w:cs="noto sans symbols"/>
       </w:rPr>
     </w:lvl>
     <w:lvl w:ilvl="6">
@@ -7809,7 +8400,7 @@
         <w:ind w:left="5040" w:hanging="360"/>
       </w:pPr>
       <w:rPr>
-        <w:rFonts w:ascii="Noto Sans Symbols" w:eastAsia="Noto Sans Symbols" w:hAnsi="Noto Sans Symbols" w:cs="Noto Sans Symbols"/>
+        <w:rFonts w:ascii="noto sans symbols" w:eastAsia="noto sans symbols" w:hAnsi="noto sans symbols" w:cs="noto sans symbols"/>
       </w:rPr>
     </w:lvl>
     <w:lvl w:ilvl="7">
@@ -7833,7 +8424,7 @@
         <w:ind w:left="6480" w:hanging="360"/>
       </w:pPr>
       <w:rPr>
-        <w:rFonts w:ascii="Noto Sans Symbols" w:eastAsia="Noto Sans Symbols" w:hAnsi="Noto Sans Symbols" w:cs="Noto Sans Symbols"/>
+        <w:rFonts w:ascii="noto sans symbols" w:eastAsia="noto sans symbols" w:hAnsi="noto sans symbols" w:cs="noto sans symbols"/>
       </w:rPr>
     </w:lvl>
   </w:abstractNum>
@@ -7850,7 +8441,7 @@
         <w:ind w:left="720" w:hanging="360"/>
       </w:pPr>
       <w:rPr>
-        <w:rFonts w:ascii="Noto Sans Symbols" w:eastAsia="Noto Sans Symbols" w:hAnsi="Noto Sans Symbols" w:cs="Noto Sans Symbols"/>
+        <w:rFonts w:ascii="noto sans symbols" w:eastAsia="noto sans symbols" w:hAnsi="noto sans symbols" w:cs="noto sans symbols"/>
       </w:rPr>
     </w:lvl>
     <w:lvl w:ilvl="1">
@@ -7874,7 +8465,7 @@
         <w:ind w:left="2160" w:hanging="360"/>
       </w:pPr>
       <w:rPr>
-        <w:rFonts w:ascii="Noto Sans Symbols" w:eastAsia="Noto Sans Symbols" w:hAnsi="Noto Sans Symbols" w:cs="Noto Sans Symbols"/>
+        <w:rFonts w:ascii="noto sans symbols" w:eastAsia="noto sans symbols" w:hAnsi="noto sans symbols" w:cs="noto sans symbols"/>
       </w:rPr>
     </w:lvl>
     <w:lvl w:ilvl="3">
@@ -7886,7 +8477,7 @@
         <w:ind w:left="2880" w:hanging="360"/>
       </w:pPr>
       <w:rPr>
-        <w:rFonts w:ascii="Noto Sans Symbols" w:eastAsia="Noto Sans Symbols" w:hAnsi="Noto Sans Symbols" w:cs="Noto Sans Symbols"/>
+        <w:rFonts w:ascii="noto sans symbols" w:eastAsia="noto sans symbols" w:hAnsi="noto sans symbols" w:cs="noto sans symbols"/>
       </w:rPr>
     </w:lvl>
     <w:lvl w:ilvl="4">
@@ -7910,7 +8501,7 @@
         <w:ind w:left="4320" w:hanging="360"/>
       </w:pPr>
       <w:rPr>
-        <w:rFonts w:ascii="Noto Sans Symbols" w:eastAsia="Noto Sans Symbols" w:hAnsi="Noto Sans Symbols" w:cs="Noto Sans Symbols"/>
+        <w:rFonts w:ascii="noto sans symbols" w:eastAsia="noto sans symbols" w:hAnsi="noto sans symbols" w:cs="noto sans symbols"/>
       </w:rPr>
     </w:lvl>
     <w:lvl w:ilvl="6">
@@ -7922,7 +8513,7 @@
         <w:ind w:left="5040" w:hanging="360"/>
       </w:pPr>
       <w:rPr>
-        <w:rFonts w:ascii="Noto Sans Symbols" w:eastAsia="Noto Sans Symbols" w:hAnsi="Noto Sans Symbols" w:cs="Noto Sans Symbols"/>
+        <w:rFonts w:ascii="noto sans symbols" w:eastAsia="noto sans symbols" w:hAnsi="noto sans symbols" w:cs="noto sans symbols"/>
       </w:rPr>
     </w:lvl>
     <w:lvl w:ilvl="7">
@@ -7946,7 +8537,7 @@
         <w:ind w:left="6480" w:hanging="360"/>
       </w:pPr>
       <w:rPr>
-        <w:rFonts w:ascii="Noto Sans Symbols" w:eastAsia="Noto Sans Symbols" w:hAnsi="Noto Sans Symbols" w:cs="Noto Sans Symbols"/>
+        <w:rFonts w:ascii="noto sans symbols" w:eastAsia="noto sans symbols" w:hAnsi="noto sans symbols" w:cs="noto sans symbols"/>
       </w:rPr>
     </w:lvl>
   </w:abstractNum>
@@ -8158,31 +8749,39 @@
       </w:pPr>
     </w:lvl>
   </w:abstractNum>
-  <w:num w:numId="1">
+  <w:num w:numId="1" w16cid:durableId="903686771">
     <w:abstractNumId w:val="0"/>
   </w:num>
-  <w:num w:numId="2">
+  <w:num w:numId="2" w16cid:durableId="187527454">
     <w:abstractNumId w:val="4"/>
   </w:num>
-  <w:num w:numId="3">
+  <w:num w:numId="3" w16cid:durableId="564492039">
     <w:abstractNumId w:val="6"/>
   </w:num>
-  <w:num w:numId="4">
+  <w:num w:numId="4" w16cid:durableId="593561066">
     <w:abstractNumId w:val="2"/>
   </w:num>
-  <w:num w:numId="5">
+  <w:num w:numId="5" w16cid:durableId="512690588">
     <w:abstractNumId w:val="5"/>
   </w:num>
-  <w:num w:numId="6">
+  <w:num w:numId="6" w16cid:durableId="700280658">
     <w:abstractNumId w:val="3"/>
   </w:num>
-  <w:num w:numId="7">
+  <w:num w:numId="7" w16cid:durableId="804200970">
     <w:abstractNumId w:val="1"/>
   </w:num>
-  <w:num w:numId="8">
+  <w:num w:numId="8" w16cid:durableId="1800369090">
     <w:abstractNumId w:val="7"/>
   </w:num>
 </w:numbering>
+</file>
+
+<file path=word/people.xml><?xml version="1.0" encoding="utf-8"?>
+<w15:people xmlns:wpc="http://schemas.microsoft.com/office/word/2010/wordprocessingCanvas" xmlns:cx="http://schemas.microsoft.com/office/drawing/2014/chartex" xmlns:cx1="http://schemas.microsoft.com/office/drawing/2015/9/8/chartex" xmlns:cx2="http://schemas.microsoft.com/office/drawing/2015/10/21/chartex" xmlns:cx3="http://schemas.microsoft.com/office/drawing/2016/5/9/chartex" xmlns:cx4="http://schemas.microsoft.com/office/drawing/2016/5/10/chartex" xmlns:cx5="http://schemas.microsoft.com/office/drawing/2016/5/11/chartex" xmlns:cx6="http://schemas.microsoft.com/office/drawing/2016/5/12/chartex" xmlns:cx7="http://schemas.microsoft.com/office/drawing/2016/5/13/chartex" xmlns:cx8="http://schemas.microsoft.com/office/drawing/2016/5/14/chartex" xmlns:mc="http://schemas.openxmlformats.org/markup-compatibility/2006" xmlns:aink="http://schemas.microsoft.com/office/drawing/2016/ink" xmlns:am3d="http://schemas.microsoft.com/office/drawing/2017/model3d" xmlns:o="urn:schemas-microsoft-com:office:office" xmlns:oel="http://schemas.microsoft.com/office/2019/extlst" xmlns:r="http://schemas.openxmlformats.org/officeDocument/2006/relationships" xmlns:m="http://schemas.openxmlformats.org/officeDocument/2006/math" xmlns:v="urn:schemas-microsoft-com:vml" xmlns:wp14="http://schemas.microsoft.com/office/word/2010/wordprocessingDrawing" xmlns:wp="http://schemas.openxmlformats.org/drawingml/2006/wordprocessingDrawing" xmlns:w10="urn:schemas-microsoft-com:office:word" xmlns:w="http://schemas.openxmlformats.org/wordprocessingml/2006/main" xmlns:w14="http://schemas.microsoft.com/office/word/2010/wordml" xmlns:w15="http://schemas.microsoft.com/office/word/2012/wordml" xmlns:w16cex="http://schemas.microsoft.com/office/word/2018/wordml/cex" xmlns:w16cid="http://schemas.microsoft.com/office/word/2016/wordml/cid" xmlns:w16="http://schemas.microsoft.com/office/word/2018/wordml" xmlns:w16sdtdh="http://schemas.microsoft.com/office/word/2020/wordml/sdtdatahash" xmlns:w16se="http://schemas.microsoft.com/office/word/2015/wordml/symex" xmlns:wpg="http://schemas.microsoft.com/office/word/2010/wordprocessingGroup" xmlns:wpi="http://schemas.microsoft.com/office/word/2010/wordprocessingInk" xmlns:wne="http://schemas.microsoft.com/office/word/2006/wordml" xmlns:wps="http://schemas.microsoft.com/office/word/2010/wordprocessingShape" mc:Ignorable="w14 w15 w16se w16cid w16 w16cex w16sdtdh wp14">
+  <w15:person w15:author="Imke Endjer">
+    <w15:presenceInfo w15:providerId="AD" w15:userId="S::imke.endjer@uni-oldenburg.de::1afa6594-d4a8-48a2-b73b-6dd640e31d31"/>
+  </w15:person>
+</w15:people>
 </file>
 
 <file path=word/styles.xml><?xml version="1.0" encoding="utf-8"?>
@@ -8620,7 +9219,6 @@
     <w:next w:val="Standard"/>
     <w:link w:val="berschrift2Zchn"/>
     <w:uiPriority w:val="9"/>
-    <w:semiHidden/>
     <w:unhideWhenUsed/>
     <w:qFormat/>
     <w:rsid w:val="004F3563"/>
@@ -21101,7 +21699,7 @@
     <w:basedOn w:val="NormaleTabelle"/>
     <w:rsid w:val="007B31E8"/>
     <w:rPr>
-      <w:rFonts w:ascii="Helvetica Neue" w:eastAsia="Helvetica Neue" w:hAnsi="Helvetica Neue" w:cs="Helvetica Neue"/>
+      <w:rFonts w:ascii="helvetica neue" w:eastAsia="helvetica neue" w:hAnsi="helvetica neue" w:cs="helvetica neue"/>
       <w:lang w:eastAsia="zh-CN"/>
     </w:rPr>
     <w:tblPr>
@@ -21259,7 +21857,7 @@
     <w:basedOn w:val="NormaleTabelle"/>
     <w:rsid w:val="00C532C5"/>
     <w:rPr>
-      <w:rFonts w:ascii="Helvetica Neue" w:eastAsia="Helvetica Neue" w:hAnsi="Helvetica Neue" w:cs="Helvetica Neue"/>
+      <w:rFonts w:ascii="helvetica neue" w:eastAsia="helvetica neue" w:hAnsi="helvetica neue" w:cs="helvetica neue"/>
     </w:rPr>
     <w:tblPr>
       <w:tblStyleRowBandSize w:val="1"/>
@@ -21596,7 +22194,7 @@
     <w:basedOn w:val="NormaleTabelle"/>
     <w:rsid w:val="00893056"/>
     <w:rPr>
-      <w:rFonts w:ascii="Helvetica Neue" w:eastAsia="Helvetica Neue" w:hAnsi="Helvetica Neue" w:cs="Helvetica Neue"/>
+      <w:rFonts w:ascii="helvetica neue" w:eastAsia="helvetica neue" w:hAnsi="helvetica neue" w:cs="helvetica neue"/>
       <w:lang w:eastAsia="zh-CN"/>
     </w:rPr>
     <w:tblPr>
@@ -21742,7 +22340,7 @@
       <w:spacing w:after="0" w:line="240" w:lineRule="auto"/>
     </w:pPr>
     <w:rPr>
-      <w:rFonts w:ascii="Helvetica Neue" w:eastAsia="Helvetica Neue" w:hAnsi="Helvetica Neue" w:cs="Helvetica Neue"/>
+      <w:rFonts w:ascii="helvetica neue" w:eastAsia="helvetica neue" w:hAnsi="helvetica neue" w:cs="helvetica neue"/>
       <w:color w:val="404040"/>
       <w:sz w:val="20"/>
       <w:szCs w:val="20"/>
@@ -21751,9 +22349,7 @@
       <w:tblStyleRowBandSize w:val="1"/>
       <w:tblStyleColBandSize w:val="1"/>
       <w:tblCellMar>
-        <w:top w:w="0" w:type="dxa"/>
         <w:left w:w="115" w:type="dxa"/>
-        <w:bottom w:w="0" w:type="dxa"/>
         <w:right w:w="115" w:type="dxa"/>
       </w:tblCellMar>
     </w:tblPr>
@@ -21779,7 +22375,7 @@
       <w:spacing w:after="0" w:line="240" w:lineRule="auto"/>
     </w:pPr>
     <w:rPr>
-      <w:rFonts w:ascii="Helvetica Neue" w:eastAsia="Helvetica Neue" w:hAnsi="Helvetica Neue" w:cs="Helvetica Neue"/>
+      <w:rFonts w:ascii="helvetica neue" w:eastAsia="helvetica neue" w:hAnsi="helvetica neue" w:cs="helvetica neue"/>
       <w:color w:val="404040"/>
       <w:sz w:val="20"/>
       <w:szCs w:val="20"/>
@@ -21788,9 +22384,7 @@
       <w:tblStyleRowBandSize w:val="1"/>
       <w:tblStyleColBandSize w:val="1"/>
       <w:tblCellMar>
-        <w:top w:w="0" w:type="dxa"/>
         <w:left w:w="115" w:type="dxa"/>
-        <w:bottom w:w="0" w:type="dxa"/>
         <w:right w:w="115" w:type="dxa"/>
       </w:tblCellMar>
     </w:tblPr>
@@ -21804,7 +22398,7 @@
       <w:spacing w:after="0" w:line="240" w:lineRule="auto"/>
     </w:pPr>
     <w:rPr>
-      <w:rFonts w:ascii="Helvetica Neue" w:eastAsia="Helvetica Neue" w:hAnsi="Helvetica Neue" w:cs="Helvetica Neue"/>
+      <w:rFonts w:ascii="helvetica neue" w:eastAsia="helvetica neue" w:hAnsi="helvetica neue" w:cs="helvetica neue"/>
       <w:color w:val="404040"/>
       <w:sz w:val="20"/>
       <w:szCs w:val="20"/>
@@ -21813,9 +22407,7 @@
       <w:tblStyleRowBandSize w:val="1"/>
       <w:tblStyleColBandSize w:val="1"/>
       <w:tblCellMar>
-        <w:top w:w="0" w:type="dxa"/>
         <w:left w:w="115" w:type="dxa"/>
-        <w:bottom w:w="0" w:type="dxa"/>
         <w:right w:w="115" w:type="dxa"/>
       </w:tblCellMar>
     </w:tblPr>
@@ -21829,7 +22421,7 @@
       <w:spacing w:after="0" w:line="240" w:lineRule="auto"/>
     </w:pPr>
     <w:rPr>
-      <w:rFonts w:ascii="Helvetica Neue" w:eastAsia="Helvetica Neue" w:hAnsi="Helvetica Neue" w:cs="Helvetica Neue"/>
+      <w:rFonts w:ascii="helvetica neue" w:eastAsia="helvetica neue" w:hAnsi="helvetica neue" w:cs="helvetica neue"/>
       <w:color w:val="404040"/>
       <w:sz w:val="20"/>
       <w:szCs w:val="20"/>
@@ -21838,9 +22430,7 @@
       <w:tblStyleRowBandSize w:val="1"/>
       <w:tblStyleColBandSize w:val="1"/>
       <w:tblCellMar>
-        <w:top w:w="0" w:type="dxa"/>
         <w:left w:w="115" w:type="dxa"/>
-        <w:bottom w:w="0" w:type="dxa"/>
         <w:right w:w="115" w:type="dxa"/>
       </w:tblCellMar>
     </w:tblPr>
@@ -21854,7 +22444,7 @@
       <w:spacing w:after="0" w:line="240" w:lineRule="auto"/>
     </w:pPr>
     <w:rPr>
-      <w:rFonts w:ascii="Helvetica Neue" w:eastAsia="Helvetica Neue" w:hAnsi="Helvetica Neue" w:cs="Helvetica Neue"/>
+      <w:rFonts w:ascii="helvetica neue" w:eastAsia="helvetica neue" w:hAnsi="helvetica neue" w:cs="helvetica neue"/>
       <w:color w:val="404040"/>
       <w:sz w:val="20"/>
       <w:szCs w:val="20"/>
@@ -21863,9 +22453,7 @@
       <w:tblStyleRowBandSize w:val="1"/>
       <w:tblStyleColBandSize w:val="1"/>
       <w:tblCellMar>
-        <w:top w:w="0" w:type="dxa"/>
         <w:left w:w="115" w:type="dxa"/>
-        <w:bottom w:w="0" w:type="dxa"/>
         <w:right w:w="115" w:type="dxa"/>
       </w:tblCellMar>
     </w:tblPr>
@@ -21879,7 +22467,7 @@
       <w:spacing w:after="0" w:line="240" w:lineRule="auto"/>
     </w:pPr>
     <w:rPr>
-      <w:rFonts w:ascii="Helvetica Neue" w:eastAsia="Helvetica Neue" w:hAnsi="Helvetica Neue" w:cs="Helvetica Neue"/>
+      <w:rFonts w:ascii="helvetica neue" w:eastAsia="helvetica neue" w:hAnsi="helvetica neue" w:cs="helvetica neue"/>
       <w:color w:val="404040"/>
       <w:sz w:val="20"/>
       <w:szCs w:val="20"/>
@@ -21888,9 +22476,7 @@
       <w:tblStyleRowBandSize w:val="1"/>
       <w:tblStyleColBandSize w:val="1"/>
       <w:tblCellMar>
-        <w:top w:w="0" w:type="dxa"/>
         <w:left w:w="115" w:type="dxa"/>
-        <w:bottom w:w="0" w:type="dxa"/>
         <w:right w:w="115" w:type="dxa"/>
       </w:tblCellMar>
     </w:tblPr>
@@ -21928,7 +22514,7 @@
       <w:spacing w:after="0" w:line="240" w:lineRule="auto"/>
     </w:pPr>
     <w:rPr>
-      <w:rFonts w:ascii="Helvetica Neue" w:eastAsia="Helvetica Neue" w:hAnsi="Helvetica Neue" w:cs="Helvetica Neue"/>
+      <w:rFonts w:ascii="helvetica neue" w:eastAsia="helvetica neue" w:hAnsi="helvetica neue" w:cs="helvetica neue"/>
       <w:color w:val="404040"/>
       <w:sz w:val="20"/>
       <w:szCs w:val="20"/>
@@ -21937,9 +22523,7 @@
       <w:tblStyleRowBandSize w:val="1"/>
       <w:tblStyleColBandSize w:val="1"/>
       <w:tblCellMar>
-        <w:top w:w="0" w:type="dxa"/>
         <w:left w:w="115" w:type="dxa"/>
-        <w:bottom w:w="0" w:type="dxa"/>
         <w:right w:w="115" w:type="dxa"/>
       </w:tblCellMar>
     </w:tblPr>
@@ -21969,6 +22553,19 @@
         <w:shd w:val="clear" w:color="auto" w:fill="FFF2CC"/>
       </w:tcPr>
     </w:tblStylePr>
+  </w:style>
+  <w:style w:type="paragraph" w:styleId="berarbeitung">
+    <w:name w:val="Revision"/>
+    <w:hidden/>
+    <w:uiPriority w:val="99"/>
+    <w:semiHidden/>
+    <w:rsid w:val="00424EF8"/>
+    <w:pPr>
+      <w:spacing w:after="0" w:line="240" w:lineRule="auto"/>
+    </w:pPr>
+    <w:rPr>
+      <w:bCs/>
+    </w:rPr>
   </w:style>
 </w:styles>
 </file>
@@ -22190,8 +22787,8 @@
 <file path=customXml/itemProps1.xml><?xml version="1.0" encoding="utf-8"?>
 <ds:datastoreItem xmlns:ds="http://schemas.openxmlformats.org/officeDocument/2006/customXml" ds:itemID="{11111111-1234-1234-1234-123412341234}">
   <ds:schemaRefs>
+    <ds:schemaRef ds:uri="http://customooxmlschemas.google.com/"/>
     <ds:schemaRef ds:uri="http://schemas.openxmlformats.org/officeDocument/2006/relationships"/>
-    <ds:schemaRef ds:uri="http://customooxmlschemas.google.com/"/>
   </ds:schemaRefs>
 </ds:datastoreItem>
 </file>
</xml_diff>